<commit_message>
TC Canon: 15 capítulos con capturas enderezadas y una por plana; manual unido (270 pasos, 313 páginas)
El PDF y el DOCX del manual unido superan los 100 MB que admite GitHub y no
se respaldan; los PDF y DOCX de cada capítulo sí están en resultados/TC_*/.

Co-Authored-By: Claude Fable 5.1 <noreply@anthropic.com>
Claude-Session: https://claude.ai/code/session_01ULRY7Vd3j1Y2aQaqmzKdgd
</commit_message>
<xml_diff>
--- a/resumen-videos/resultados/TC_00_Instalacion_y_consola/TC_00_Instalacion_y_consola.docx
+++ b/resumen-videos/resultados/TC_00_Instalacion_y_consola/TC_00_Instalacion_y_consola.docx
@@ -4,7 +4,7 @@
   <w:body>
     <w:p>
       <w:pPr>
-        <w:spacing w:before="1191" w:after="0" w:line="240" w:lineRule="auto"/>
+        <w:spacing w:before="2189" w:after="0" w:line="240" w:lineRule="auto"/>
         <w:ind w:left="850" w:right="850"/>
       </w:pPr>
       <w:r>
@@ -213,7 +213,7 @@
           <w:bottom w:val="single" w:sz="4" w:space="2" w:color="BBBBBB"/>
         </w:pBdr>
         <w:tabs>
-          <w:tab w:pos="15704" w:val="right"/>
+          <w:tab w:pos="10772" w:val="right"/>
         </w:tabs>
         <w:spacing w:before="0" w:after="80" w:line="192" w:lineRule="exact"/>
       </w:pPr>
@@ -265,8 +265,8 @@
         <w:tblLook w:firstColumn="1" w:firstRow="1" w:lastColumn="0" w:lastRow="0" w:noHBand="0" w:noVBand="1" w:val="04A0"/>
       </w:tblPr>
       <w:tblGrid>
-        <w:gridCol w:w="7852"/>
-        <w:gridCol w:w="7852"/>
+        <w:gridCol w:w="5386"/>
+        <w:gridCol w:w="5386"/>
       </w:tblGrid>
       <w:tr>
         <w:trPr>
@@ -274,7 +274,7 @@
         </w:trPr>
         <w:tc>
           <w:tcPr>
-            <w:tcW w:type="dxa" w:w="13890"/>
+            <w:tcW w:type="dxa" w:w="8957"/>
           </w:tcPr>
           <w:p>
             <w:pPr>
@@ -304,7 +304,7 @@
         </w:trPr>
         <w:tc>
           <w:tcPr>
-            <w:tcW w:type="dxa" w:w="13890"/>
+            <w:tcW w:type="dxa" w:w="8957"/>
           </w:tcPr>
           <w:p>
             <w:pPr>
@@ -352,7 +352,7 @@
         </w:trPr>
         <w:tc>
           <w:tcPr>
-            <w:tcW w:type="dxa" w:w="13890"/>
+            <w:tcW w:type="dxa" w:w="8957"/>
           </w:tcPr>
           <w:p>
             <w:pPr>
@@ -382,7 +382,7 @@
         </w:trPr>
         <w:tc>
           <w:tcPr>
-            <w:tcW w:type="dxa" w:w="13890"/>
+            <w:tcW w:type="dxa" w:w="8957"/>
           </w:tcPr>
           <w:p>
             <w:pPr>
@@ -419,7 +419,7 @@
                 <w:sz w:val="20"/>
               </w:rPr>
               <w:tab/>
-              <w:t>00:32 · pág. 3</w:t>
+              <w:t>00:32 · pág. 4</w:t>
             </w:r>
           </w:p>
         </w:tc>
@@ -430,7 +430,7 @@
         </w:trPr>
         <w:tc>
           <w:tcPr>
-            <w:tcW w:type="dxa" w:w="13890"/>
+            <w:tcW w:type="dxa" w:w="8957"/>
           </w:tcPr>
           <w:p>
             <w:pPr>
@@ -460,7 +460,7 @@
         </w:trPr>
         <w:tc>
           <w:tcPr>
-            <w:tcW w:type="dxa" w:w="13890"/>
+            <w:tcW w:type="dxa" w:w="8957"/>
           </w:tcPr>
           <w:p>
             <w:pPr>
@@ -497,7 +497,7 @@
                 <w:sz w:val="20"/>
               </w:rPr>
               <w:tab/>
-              <w:t>00:41 · pág. 4</w:t>
+              <w:t>00:41 · pág. 5</w:t>
             </w:r>
           </w:p>
         </w:tc>
@@ -508,7 +508,7 @@
         </w:trPr>
         <w:tc>
           <w:tcPr>
-            <w:tcW w:type="dxa" w:w="13890"/>
+            <w:tcW w:type="dxa" w:w="8957"/>
           </w:tcPr>
           <w:p>
             <w:pPr>
@@ -545,7 +545,7 @@
                 <w:sz w:val="20"/>
               </w:rPr>
               <w:tab/>
-              <w:t>01:08 · pág. 4</w:t>
+              <w:t>01:08 · pág. 6</w:t>
             </w:r>
           </w:p>
         </w:tc>
@@ -556,7 +556,7 @@
         </w:trPr>
         <w:tc>
           <w:tcPr>
-            <w:tcW w:type="dxa" w:w="13890"/>
+            <w:tcW w:type="dxa" w:w="8957"/>
           </w:tcPr>
           <w:p>
             <w:pPr>
@@ -593,7 +593,7 @@
                 <w:sz w:val="20"/>
               </w:rPr>
               <w:tab/>
-              <w:t>01:21 · pág. 5</w:t>
+              <w:t>01:21 · pág. 7</w:t>
             </w:r>
           </w:p>
         </w:tc>
@@ -604,7 +604,7 @@
         </w:trPr>
         <w:tc>
           <w:tcPr>
-            <w:tcW w:type="dxa" w:w="13890"/>
+            <w:tcW w:type="dxa" w:w="8957"/>
           </w:tcPr>
           <w:p>
             <w:pPr>
@@ -634,7 +634,7 @@
         </w:trPr>
         <w:tc>
           <w:tcPr>
-            <w:tcW w:type="dxa" w:w="13890"/>
+            <w:tcW w:type="dxa" w:w="8957"/>
           </w:tcPr>
           <w:p>
             <w:pPr>
@@ -671,7 +671,7 @@
                 <w:sz w:val="20"/>
               </w:rPr>
               <w:tab/>
-              <w:t>01:54 · pág. 5</w:t>
+              <w:t>01:54 · pág. 8</w:t>
             </w:r>
           </w:p>
         </w:tc>
@@ -682,7 +682,7 @@
         </w:trPr>
         <w:tc>
           <w:tcPr>
-            <w:tcW w:type="dxa" w:w="13890"/>
+            <w:tcW w:type="dxa" w:w="8957"/>
           </w:tcPr>
           <w:p>
             <w:pPr>
@@ -719,7 +719,7 @@
                 <w:sz w:val="20"/>
               </w:rPr>
               <w:tab/>
-              <w:t>02:30 · pág. 6</w:t>
+              <w:t>02:30 · pág. 9</w:t>
             </w:r>
           </w:p>
         </w:tc>
@@ -730,7 +730,7 @@
         </w:trPr>
         <w:tc>
           <w:tcPr>
-            <w:tcW w:type="dxa" w:w="13890"/>
+            <w:tcW w:type="dxa" w:w="8957"/>
           </w:tcPr>
           <w:p>
             <w:pPr>
@@ -760,7 +760,7 @@
         </w:trPr>
         <w:tc>
           <w:tcPr>
-            <w:tcW w:type="dxa" w:w="13890"/>
+            <w:tcW w:type="dxa" w:w="8957"/>
           </w:tcPr>
           <w:p>
             <w:pPr>
@@ -797,7 +797,7 @@
                 <w:sz w:val="20"/>
               </w:rPr>
               <w:tab/>
-              <w:t>02:51 · pág. 6</w:t>
+              <w:t>02:51 · pág. 10</w:t>
             </w:r>
           </w:p>
         </w:tc>
@@ -808,7 +808,7 @@
         </w:trPr>
         <w:tc>
           <w:tcPr>
-            <w:tcW w:type="dxa" w:w="13890"/>
+            <w:tcW w:type="dxa" w:w="8957"/>
           </w:tcPr>
           <w:p>
             <w:pPr>
@@ -845,7 +845,7 @@
                 <w:sz w:val="20"/>
               </w:rPr>
               <w:tab/>
-              <w:t>03:30 · pág. 7</w:t>
+              <w:t>03:30 · pág. 11</w:t>
             </w:r>
           </w:p>
         </w:tc>
@@ -856,7 +856,7 @@
         </w:trPr>
         <w:tc>
           <w:tcPr>
-            <w:tcW w:type="dxa" w:w="13890"/>
+            <w:tcW w:type="dxa" w:w="8957"/>
           </w:tcPr>
           <w:p>
             <w:pPr>
@@ -886,7 +886,7 @@
         </w:trPr>
         <w:tc>
           <w:tcPr>
-            <w:tcW w:type="dxa" w:w="13890"/>
+            <w:tcW w:type="dxa" w:w="8957"/>
           </w:tcPr>
           <w:p>
             <w:pPr>
@@ -923,7 +923,7 @@
                 <w:sz w:val="20"/>
               </w:rPr>
               <w:tab/>
-              <w:t>04:09 · pág. 7</w:t>
+              <w:t>04:09 · pág. 12</w:t>
             </w:r>
           </w:p>
         </w:tc>
@@ -934,7 +934,7 @@
         </w:trPr>
         <w:tc>
           <w:tcPr>
-            <w:tcW w:type="dxa" w:w="13890"/>
+            <w:tcW w:type="dxa" w:w="8957"/>
           </w:tcPr>
           <w:p>
             <w:pPr>
@@ -971,7 +971,7 @@
                 <w:sz w:val="20"/>
               </w:rPr>
               <w:tab/>
-              <w:t>04:10 · pág. 8</w:t>
+              <w:t>04:10 · pág. 13</w:t>
             </w:r>
           </w:p>
         </w:tc>
@@ -982,7 +982,7 @@
         </w:trPr>
         <w:tc>
           <w:tcPr>
-            <w:tcW w:type="dxa" w:w="13890"/>
+            <w:tcW w:type="dxa" w:w="8957"/>
           </w:tcPr>
           <w:p>
             <w:pPr>
@@ -1019,7 +1019,7 @@
                 <w:sz w:val="20"/>
               </w:rPr>
               <w:tab/>
-              <w:t>04:21 · pág. 8</w:t>
+              <w:t>04:21 · pág. 14</w:t>
             </w:r>
           </w:p>
         </w:tc>
@@ -1030,7 +1030,7 @@
         </w:trPr>
         <w:tc>
           <w:tcPr>
-            <w:tcW w:type="dxa" w:w="13890"/>
+            <w:tcW w:type="dxa" w:w="8957"/>
           </w:tcPr>
           <w:p>
             <w:pPr>
@@ -1060,7 +1060,7 @@
         </w:trPr>
         <w:tc>
           <w:tcPr>
-            <w:tcW w:type="dxa" w:w="13890"/>
+            <w:tcW w:type="dxa" w:w="8957"/>
           </w:tcPr>
           <w:p>
             <w:pPr>
@@ -1097,7 +1097,7 @@
                 <w:sz w:val="20"/>
               </w:rPr>
               <w:tab/>
-              <w:t>05:04 · pág. 9</w:t>
+              <w:t>05:04 · pág. 15</w:t>
             </w:r>
           </w:p>
         </w:tc>
@@ -1108,7 +1108,7 @@
         </w:trPr>
         <w:tc>
           <w:tcPr>
-            <w:tcW w:type="dxa" w:w="13890"/>
+            <w:tcW w:type="dxa" w:w="8957"/>
           </w:tcPr>
           <w:p>
             <w:pPr>
@@ -1145,7 +1145,7 @@
                 <w:sz w:val="20"/>
               </w:rPr>
               <w:tab/>
-              <w:t>06:11 · pág. 9</w:t>
+              <w:t>06:11 · pág. 16</w:t>
             </w:r>
           </w:p>
         </w:tc>
@@ -1156,7 +1156,7 @@
         </w:trPr>
         <w:tc>
           <w:tcPr>
-            <w:tcW w:type="dxa" w:w="13890"/>
+            <w:tcW w:type="dxa" w:w="8957"/>
           </w:tcPr>
           <w:p>
             <w:pPr>
@@ -1186,7 +1186,7 @@
         </w:trPr>
         <w:tc>
           <w:tcPr>
-            <w:tcW w:type="dxa" w:w="13890"/>
+            <w:tcW w:type="dxa" w:w="8957"/>
           </w:tcPr>
           <w:p>
             <w:pPr>
@@ -1223,7 +1223,7 @@
                 <w:sz w:val="20"/>
               </w:rPr>
               <w:tab/>
-              <w:t>08:31 · pág. 10</w:t>
+              <w:t>08:31 · pág. 17</w:t>
             </w:r>
           </w:p>
         </w:tc>
@@ -1234,7 +1234,7 @@
         </w:trPr>
         <w:tc>
           <w:tcPr>
-            <w:tcW w:type="dxa" w:w="13890"/>
+            <w:tcW w:type="dxa" w:w="8957"/>
           </w:tcPr>
           <w:p>
             <w:pPr>
@@ -1271,7 +1271,7 @@
                 <w:sz w:val="20"/>
               </w:rPr>
               <w:tab/>
-              <w:t>09:43 · pág. 10</w:t>
+              <w:t>09:43 · pág. 18</w:t>
             </w:r>
           </w:p>
         </w:tc>
@@ -1279,12 +1279,24 @@
     </w:tbl>
     <w:p>
       <w:pPr>
-        <w:pageBreakBefore/>
+        <w:sectPr>
+          <w:footerReference w:type="default" r:id="rId9"/>
+          <w:pgSz w:w="11906" w:h="16838"/>
+          <w:pgMar w:top="567" w:right="567" w:bottom="567" w:left="567" w:header="283" w:footer="283" w:gutter="0"/>
+          <w:cols w:space="720"/>
+          <w:titlePg/>
+          <w:docGrid w:linePitch="360"/>
+        </w:sectPr>
+      </w:pPr>
+    </w:p>
+    <w:p>
+      <w:pPr>
+        <w:pageBreakBefore w:val="0"/>
         <w:pBdr>
           <w:bottom w:val="single" w:sz="4" w:space="2" w:color="BBBBBB"/>
         </w:pBdr>
         <w:tabs>
-          <w:tab w:pos="15704" w:val="right"/>
+          <w:tab w:pos="10772" w:val="right"/>
         </w:tabs>
         <w:spacing w:before="0" w:after="80" w:line="192" w:lineRule="exact"/>
       </w:pPr>
@@ -1305,7 +1317,7 @@
           <w:sz w:val="16"/>
         </w:rPr>
         <w:tab/>
-        <w:t>Pasos 1–2 de 16</w:t>
+        <w:t>Paso 1 de 16</w:t>
       </w:r>
     </w:p>
     <w:tbl>
@@ -1322,16 +1334,15 @@
         <w:tblLook w:firstColumn="1" w:firstRow="1" w:lastColumn="0" w:lastRow="0" w:noHBand="0" w:noVBand="1" w:val="04A0"/>
       </w:tblPr>
       <w:tblGrid>
-        <w:gridCol w:w="7852"/>
-        <w:gridCol w:w="7852"/>
+        <w:gridCol w:w="10772"/>
       </w:tblGrid>
       <w:tr>
         <w:trPr>
-          <w:trHeight w:val="10148" w:hRule="exact"/>
+          <w:trHeight w:val="15080" w:hRule="exact"/>
         </w:trPr>
         <w:tc>
           <w:tcPr>
-            <w:tcW w:type="dxa" w:w="7710"/>
+            <w:tcW w:type="dxa" w:w="10772"/>
             <w:vAlign w:val="top"/>
           </w:tcPr>
           <w:p>
@@ -1348,7 +1359,7 @@
               </w:rPr>
               <w:drawing>
                 <wp:inline xmlns:a="http://schemas.openxmlformats.org/drawingml/2006/main" xmlns:pic="http://schemas.openxmlformats.org/drawingml/2006/picture">
-                  <wp:extent cx="3081701" cy="5478580"/>
+                  <wp:extent cx="4697718" cy="8351499"/>
                   <wp:docPr id="1" name="Picture 1"/>
                   <wp:cNvGraphicFramePr>
                     <a:graphicFrameLocks noChangeAspect="1"/>
@@ -1369,7 +1380,7 @@
                         <pic:spPr>
                           <a:xfrm>
                             <a:off x="0" y="0"/>
-                            <a:ext cx="3081701" cy="5478580"/>
+                            <a:ext cx="4697718" cy="8351499"/>
                           </a:xfrm>
                           <a:prstGeom prst="rect"/>
                         </pic:spPr>
@@ -1382,50 +1393,113 @@
           </w:p>
           <w:p>
             <w:pPr>
-              <w:spacing w:before="0" w:after="20" w:line="204" w:lineRule="exact"/>
+              <w:spacing w:before="0" w:after="20" w:line="216" w:lineRule="exact"/>
             </w:pPr>
             <w:r>
               <w:rPr>
                 <w:b w:val="0"/>
                 <w:i w:val="0"/>
                 <w:color w:val="666666"/>
-                <w:sz w:val="17"/>
+                <w:sz w:val="18"/>
               </w:rPr>
               <w:t>PASO 1 · DESCRIPCIÓN GENERAL · 00:07</w:t>
             </w:r>
           </w:p>
           <w:p>
             <w:pPr>
-              <w:spacing w:before="0" w:after="20" w:line="312" w:lineRule="exact"/>
+              <w:spacing w:before="0" w:after="20" w:line="360" w:lineRule="exact"/>
             </w:pPr>
             <w:r>
               <w:rPr>
                 <w:b/>
                 <w:i w:val="0"/>
                 <w:color w:val="111111"/>
-                <w:sz w:val="26"/>
+                <w:sz w:val="30"/>
               </w:rPr>
               <w:t>Presentar el tomógrafo Aquilion Exceed LB</w:t>
             </w:r>
           </w:p>
           <w:p>
             <w:pPr>
-              <w:spacing w:before="0" w:after="0" w:line="252" w:lineRule="exact"/>
+              <w:spacing w:before="0" w:after="0" w:line="276" w:lineRule="exact"/>
             </w:pPr>
             <w:r>
               <w:rPr>
                 <w:b w:val="0"/>
                 <w:i w:val="0"/>
                 <w:color w:val="222222"/>
-                <w:sz w:val="21"/>
+                <w:sz w:val="23"/>
               </w:rPr>
               <w:t>El instructor presenta el equipo Canon Aquilion Exceed LB, diseñado para la planificación de radioterapia, oncología y traumatología.</w:t>
             </w:r>
           </w:p>
         </w:tc>
+      </w:tr>
+    </w:tbl>
+    <w:p>
+      <w:pPr>
+        <w:sectPr>
+          <w:pgSz w:w="11906" w:h="16838"/>
+          <w:pgMar w:top="567" w:right="567" w:bottom="567" w:left="567" w:header="283" w:footer="283" w:gutter="0"/>
+          <w:cols w:space="720"/>
+          <w:docGrid w:linePitch="360"/>
+        </w:sectPr>
+      </w:pPr>
+    </w:p>
+    <w:p>
+      <w:pPr>
+        <w:pageBreakBefore w:val="0"/>
+        <w:pBdr>
+          <w:bottom w:val="single" w:sz="4" w:space="2" w:color="BBBBBB"/>
+        </w:pBdr>
+        <w:tabs>
+          <w:tab w:pos="10772" w:val="right"/>
+        </w:tabs>
+        <w:spacing w:before="0" w:after="80" w:line="192" w:lineRule="exact"/>
+      </w:pPr>
+      <w:r>
+        <w:rPr>
+          <w:b w:val="0"/>
+          <w:i w:val="0"/>
+          <w:color w:val="666666"/>
+          <w:sz w:val="16"/>
+        </w:rPr>
+        <w:t>Introducción y especificaciones del Aquilion Exceed LB</w:t>
+      </w:r>
+      <w:r>
+        <w:rPr>
+          <w:b w:val="0"/>
+          <w:i w:val="0"/>
+          <w:color w:val="666666"/>
+          <w:sz w:val="16"/>
+        </w:rPr>
+        <w:tab/>
+        <w:t>Paso 2 de 16</w:t>
+      </w:r>
+    </w:p>
+    <w:tbl>
+      <w:tblPr>
+        <w:tblW w:type="auto" w:w="0"/>
+        <w:jc w:val="center"/>
+        <w:tblLayout w:type="fixed"/>
+        <w:tblCellMar>
+          <w:top w:w="28" w:type="dxa"/>
+          <w:left w:w="85" w:type="dxa"/>
+          <w:bottom w:w="0" w:type="dxa"/>
+          <w:right w:w="85" w:type="dxa"/>
+        </w:tblCellMar>
+        <w:tblLook w:firstColumn="1" w:firstRow="1" w:lastColumn="0" w:lastRow="0" w:noHBand="0" w:noVBand="1" w:val="04A0"/>
+      </w:tblPr>
+      <w:tblGrid>
+        <w:gridCol w:w="10772"/>
+      </w:tblGrid>
+      <w:tr>
+        <w:trPr>
+          <w:trHeight w:val="15080" w:hRule="exact"/>
+        </w:trPr>
         <w:tc>
           <w:tcPr>
-            <w:tcW w:type="dxa" w:w="7710"/>
+            <w:tcW w:type="dxa" w:w="10772"/>
             <w:vAlign w:val="top"/>
           </w:tcPr>
           <w:p>
@@ -1442,7 +1516,7 @@
               </w:rPr>
               <w:drawing>
                 <wp:inline xmlns:a="http://schemas.openxmlformats.org/drawingml/2006/main" xmlns:pic="http://schemas.openxmlformats.org/drawingml/2006/picture">
-                  <wp:extent cx="3081701" cy="5478580"/>
+                  <wp:extent cx="4697718" cy="8351499"/>
                   <wp:docPr id="2" name="Picture 2"/>
                   <wp:cNvGraphicFramePr>
                     <a:graphicFrameLocks noChangeAspect="1"/>
@@ -1463,7 +1537,7 @@
                         <pic:spPr>
                           <a:xfrm>
                             <a:off x="0" y="0"/>
-                            <a:ext cx="3081701" cy="5478580"/>
+                            <a:ext cx="4697718" cy="8351499"/>
                           </a:xfrm>
                           <a:prstGeom prst="rect"/>
                         </pic:spPr>
@@ -1476,42 +1550,42 @@
           </w:p>
           <w:p>
             <w:pPr>
-              <w:spacing w:before="0" w:after="20" w:line="204" w:lineRule="exact"/>
+              <w:spacing w:before="0" w:after="20" w:line="216" w:lineRule="exact"/>
             </w:pPr>
             <w:r>
               <w:rPr>
                 <w:b w:val="0"/>
                 <w:i w:val="0"/>
                 <w:color w:val="666666"/>
-                <w:sz w:val="17"/>
+                <w:sz w:val="18"/>
               </w:rPr>
               <w:t>PASO 2 · CARACTERÍSTICAS DE DISEÑO · 00:32</w:t>
             </w:r>
           </w:p>
           <w:p>
             <w:pPr>
-              <w:spacing w:before="0" w:after="20" w:line="312" w:lineRule="exact"/>
+              <w:spacing w:before="0" w:after="20" w:line="360" w:lineRule="exact"/>
             </w:pPr>
             <w:r>
               <w:rPr>
                 <w:b/>
                 <w:i w:val="0"/>
                 <w:color w:val="111111"/>
-                <w:sz w:val="26"/>
+                <w:sz w:val="30"/>
               </w:rPr>
               <w:t>Explicar la apertura de gantry</w:t>
             </w:r>
           </w:p>
           <w:p>
             <w:pPr>
-              <w:spacing w:before="0" w:after="0" w:line="252" w:lineRule="exact"/>
+              <w:spacing w:before="0" w:after="0" w:line="276" w:lineRule="exact"/>
             </w:pPr>
             <w:r>
               <w:rPr>
                 <w:b w:val="0"/>
                 <w:i w:val="0"/>
                 <w:color w:val="222222"/>
-                <w:sz w:val="21"/>
+                <w:sz w:val="23"/>
               </w:rPr>
               <w:t>Se destaca la amplia apertura de gantry de 90 cm de diámetro (Large Bore), útil para el posicionamiento de pacientes con accesorios.</w:t>
             </w:r>
@@ -1521,12 +1595,22 @@
     </w:tbl>
     <w:p>
       <w:pPr>
-        <w:pageBreakBefore/>
+        <w:sectPr>
+          <w:pgSz w:w="11906" w:h="16838"/>
+          <w:pgMar w:top="567" w:right="567" w:bottom="567" w:left="567" w:header="283" w:footer="283" w:gutter="0"/>
+          <w:cols w:space="720"/>
+          <w:docGrid w:linePitch="360"/>
+        </w:sectPr>
+      </w:pPr>
+    </w:p>
+    <w:p>
+      <w:pPr>
+        <w:pageBreakBefore w:val="0"/>
         <w:pBdr>
           <w:bottom w:val="single" w:sz="4" w:space="2" w:color="BBBBBB"/>
         </w:pBdr>
         <w:tabs>
-          <w:tab w:pos="15704" w:val="right"/>
+          <w:tab w:pos="10772" w:val="right"/>
         </w:tabs>
         <w:spacing w:before="0" w:after="80" w:line="192" w:lineRule="exact"/>
       </w:pPr>
@@ -1547,7 +1631,7 @@
           <w:sz w:val="16"/>
         </w:rPr>
         <w:tab/>
-        <w:t>Pasos 3–4 de 16</w:t>
+        <w:t>Paso 3 de 16</w:t>
       </w:r>
     </w:p>
     <w:tbl>
@@ -1564,16 +1648,15 @@
         <w:tblLook w:firstColumn="1" w:firstRow="1" w:lastColumn="0" w:lastRow="0" w:noHBand="0" w:noVBand="1" w:val="04A0"/>
       </w:tblPr>
       <w:tblGrid>
-        <w:gridCol w:w="7852"/>
-        <w:gridCol w:w="7852"/>
+        <w:gridCol w:w="10772"/>
       </w:tblGrid>
       <w:tr>
         <w:trPr>
-          <w:trHeight w:val="10148" w:hRule="exact"/>
+          <w:trHeight w:val="15080" w:hRule="exact"/>
         </w:trPr>
         <w:tc>
           <w:tcPr>
-            <w:tcW w:type="dxa" w:w="7710"/>
+            <w:tcW w:type="dxa" w:w="10772"/>
             <w:vAlign w:val="top"/>
           </w:tcPr>
           <w:p>
@@ -1590,7 +1673,7 @@
               </w:rPr>
               <w:drawing>
                 <wp:inline xmlns:a="http://schemas.openxmlformats.org/drawingml/2006/main" xmlns:pic="http://schemas.openxmlformats.org/drawingml/2006/picture">
-                  <wp:extent cx="2991690" cy="5318560"/>
+                  <wp:extent cx="4697718" cy="8351499"/>
                   <wp:docPr id="3" name="Picture 3"/>
                   <wp:cNvGraphicFramePr>
                     <a:graphicFrameLocks noChangeAspect="1"/>
@@ -1611,7 +1694,7 @@
                         <pic:spPr>
                           <a:xfrm>
                             <a:off x="0" y="0"/>
-                            <a:ext cx="2991690" cy="5318560"/>
+                            <a:ext cx="4697718" cy="8351499"/>
                           </a:xfrm>
                           <a:prstGeom prst="rect"/>
                         </pic:spPr>
@@ -1624,50 +1707,113 @@
           </w:p>
           <w:p>
             <w:pPr>
-              <w:spacing w:before="0" w:after="20" w:line="204" w:lineRule="exact"/>
+              <w:spacing w:before="0" w:after="20" w:line="216" w:lineRule="exact"/>
             </w:pPr>
             <w:r>
               <w:rPr>
                 <w:b w:val="0"/>
                 <w:i w:val="0"/>
                 <w:color w:val="666666"/>
-                <w:sz w:val="17"/>
+                <w:sz w:val="18"/>
               </w:rPr>
               <w:t>PASO 3 · ESPECIFICACIONES TÉCNICAS · 00:41</w:t>
             </w:r>
           </w:p>
           <w:p>
             <w:pPr>
-              <w:spacing w:before="0" w:after="20" w:line="312" w:lineRule="exact"/>
+              <w:spacing w:before="0" w:after="20" w:line="360" w:lineRule="exact"/>
             </w:pPr>
             <w:r>
               <w:rPr>
                 <w:b/>
                 <w:i w:val="0"/>
                 <w:color w:val="111111"/>
-                <w:sz w:val="26"/>
+                <w:sz w:val="30"/>
               </w:rPr>
               <w:t>Describir el FOV de adquisición</w:t>
             </w:r>
           </w:p>
           <w:p>
             <w:pPr>
-              <w:spacing w:before="0" w:after="0" w:line="252" w:lineRule="exact"/>
+              <w:spacing w:before="0" w:after="0" w:line="276" w:lineRule="exact"/>
             </w:pPr>
             <w:r>
               <w:rPr>
                 <w:b w:val="0"/>
                 <w:i w:val="0"/>
                 <w:color w:val="222222"/>
-                <w:sz w:val="21"/>
+                <w:sz w:val="23"/>
               </w:rPr>
               <w:t>El FOV máximo estándar es de 70 cm y cuenta con un FOV extendido de hasta 90 cm que se genera mediante la reconstrucción de datos crudos (raw data). En pantalla se leen los valores -236.0, P+1135.5 y 0.0.</w:t>
             </w:r>
           </w:p>
         </w:tc>
+      </w:tr>
+    </w:tbl>
+    <w:p>
+      <w:pPr>
+        <w:sectPr>
+          <w:pgSz w:w="11906" w:h="16838"/>
+          <w:pgMar w:top="567" w:right="567" w:bottom="567" w:left="567" w:header="283" w:footer="283" w:gutter="0"/>
+          <w:cols w:space="720"/>
+          <w:docGrid w:linePitch="360"/>
+        </w:sectPr>
+      </w:pPr>
+    </w:p>
+    <w:p>
+      <w:pPr>
+        <w:pageBreakBefore w:val="0"/>
+        <w:pBdr>
+          <w:bottom w:val="single" w:sz="4" w:space="2" w:color="BBBBBB"/>
+        </w:pBdr>
+        <w:tabs>
+          <w:tab w:pos="10772" w:val="right"/>
+        </w:tabs>
+        <w:spacing w:before="0" w:after="80" w:line="192" w:lineRule="exact"/>
+      </w:pPr>
+      <w:r>
+        <w:rPr>
+          <w:b w:val="0"/>
+          <w:i w:val="0"/>
+          <w:color w:val="666666"/>
+          <w:sz w:val="16"/>
+        </w:rPr>
+        <w:t>Introducción y especificaciones del Aquilion Exceed LB</w:t>
+      </w:r>
+      <w:r>
+        <w:rPr>
+          <w:b w:val="0"/>
+          <w:i w:val="0"/>
+          <w:color w:val="666666"/>
+          <w:sz w:val="16"/>
+        </w:rPr>
+        <w:tab/>
+        <w:t>Paso 4 de 16</w:t>
+      </w:r>
+    </w:p>
+    <w:tbl>
+      <w:tblPr>
+        <w:tblW w:type="auto" w:w="0"/>
+        <w:jc w:val="center"/>
+        <w:tblLayout w:type="fixed"/>
+        <w:tblCellMar>
+          <w:top w:w="28" w:type="dxa"/>
+          <w:left w:w="85" w:type="dxa"/>
+          <w:bottom w:w="0" w:type="dxa"/>
+          <w:right w:w="85" w:type="dxa"/>
+        </w:tblCellMar>
+        <w:tblLook w:firstColumn="1" w:firstRow="1" w:lastColumn="0" w:lastRow="0" w:noHBand="0" w:noVBand="1" w:val="04A0"/>
+      </w:tblPr>
+      <w:tblGrid>
+        <w:gridCol w:w="10772"/>
+      </w:tblGrid>
+      <w:tr>
+        <w:trPr>
+          <w:trHeight w:val="15080" w:hRule="exact"/>
+        </w:trPr>
         <w:tc>
           <w:tcPr>
-            <w:tcW w:type="dxa" w:w="7710"/>
+            <w:tcW w:type="dxa" w:w="10772"/>
             <w:vAlign w:val="top"/>
           </w:tcPr>
           <w:p>
@@ -1684,7 +1830,7 @@
               </w:rPr>
               <w:drawing>
                 <wp:inline xmlns:a="http://schemas.openxmlformats.org/drawingml/2006/main" xmlns:pic="http://schemas.openxmlformats.org/drawingml/2006/picture">
-                  <wp:extent cx="3081701" cy="5478580"/>
+                  <wp:extent cx="4697718" cy="8351499"/>
                   <wp:docPr id="4" name="Picture 4"/>
                   <wp:cNvGraphicFramePr>
                     <a:graphicFrameLocks noChangeAspect="1"/>
@@ -1705,7 +1851,7 @@
                         <pic:spPr>
                           <a:xfrm>
                             <a:off x="0" y="0"/>
-                            <a:ext cx="3081701" cy="5478580"/>
+                            <a:ext cx="4697718" cy="8351499"/>
                           </a:xfrm>
                           <a:prstGeom prst="rect"/>
                         </pic:spPr>
@@ -1718,42 +1864,42 @@
           </w:p>
           <w:p>
             <w:pPr>
-              <w:spacing w:before="0" w:after="20" w:line="204" w:lineRule="exact"/>
+              <w:spacing w:before="0" w:after="20" w:line="216" w:lineRule="exact"/>
             </w:pPr>
             <w:r>
               <w:rPr>
                 <w:b w:val="0"/>
                 <w:i w:val="0"/>
                 <w:color w:val="666666"/>
-                <w:sz w:val="17"/>
+                <w:sz w:val="18"/>
               </w:rPr>
               <w:t>PASO 4 · ESPECIFICACIONES TÉCNICAS · 01:08</w:t>
             </w:r>
           </w:p>
           <w:p>
             <w:pPr>
-              <w:spacing w:before="0" w:after="20" w:line="312" w:lineRule="exact"/>
+              <w:spacing w:before="0" w:after="20" w:line="360" w:lineRule="exact"/>
             </w:pPr>
             <w:r>
               <w:rPr>
                 <w:b/>
                 <w:i w:val="0"/>
                 <w:color w:val="111111"/>
-                <w:sz w:val="26"/>
+                <w:sz w:val="30"/>
               </w:rPr>
               <w:t>Detallar los detectores del equipo</w:t>
             </w:r>
           </w:p>
           <w:p>
             <w:pPr>
-              <w:spacing w:before="0" w:after="0" w:line="252" w:lineRule="exact"/>
+              <w:spacing w:before="0" w:after="0" w:line="276" w:lineRule="exact"/>
             </w:pPr>
             <w:r>
               <w:rPr>
                 <w:b w:val="0"/>
                 <w:i w:val="0"/>
                 <w:color w:val="222222"/>
-                <w:sz w:val="21"/>
+                <w:sz w:val="23"/>
               </w:rPr>
               <w:t>El tomógrafo posee 80 filas de detectores de 0,5 mm en el eje Z, lo que equivale a una cobertura de 40 mm (4 cm) por rotación del gantry.</w:t>
             </w:r>
@@ -1763,12 +1909,22 @@
     </w:tbl>
     <w:p>
       <w:pPr>
-        <w:pageBreakBefore/>
+        <w:sectPr>
+          <w:pgSz w:w="11906" w:h="16838"/>
+          <w:pgMar w:top="567" w:right="567" w:bottom="567" w:left="567" w:header="283" w:footer="283" w:gutter="0"/>
+          <w:cols w:space="720"/>
+          <w:docGrid w:linePitch="360"/>
+        </w:sectPr>
+      </w:pPr>
+    </w:p>
+    <w:p>
+      <w:pPr>
+        <w:pageBreakBefore w:val="0"/>
         <w:pBdr>
           <w:bottom w:val="single" w:sz="4" w:space="2" w:color="BBBBBB"/>
         </w:pBdr>
         <w:tabs>
-          <w:tab w:pos="15704" w:val="right"/>
+          <w:tab w:pos="10772" w:val="right"/>
         </w:tabs>
         <w:spacing w:before="0" w:after="80" w:line="192" w:lineRule="exact"/>
       </w:pPr>
@@ -1789,7 +1945,7 @@
           <w:sz w:val="16"/>
         </w:rPr>
         <w:tab/>
-        <w:t>Pasos 5–6 de 16</w:t>
+        <w:t>Paso 5 de 16</w:t>
       </w:r>
     </w:p>
     <w:tbl>
@@ -1806,16 +1962,15 @@
         <w:tblLook w:firstColumn="1" w:firstRow="1" w:lastColumn="0" w:lastRow="0" w:noHBand="0" w:noVBand="1" w:val="04A0"/>
       </w:tblPr>
       <w:tblGrid>
-        <w:gridCol w:w="7852"/>
-        <w:gridCol w:w="7852"/>
+        <w:gridCol w:w="10772"/>
       </w:tblGrid>
       <w:tr>
         <w:trPr>
-          <w:trHeight w:val="10148" w:hRule="exact"/>
+          <w:trHeight w:val="15080" w:hRule="exact"/>
         </w:trPr>
         <w:tc>
           <w:tcPr>
-            <w:tcW w:type="dxa" w:w="7710"/>
+            <w:tcW w:type="dxa" w:w="10772"/>
             <w:vAlign w:val="top"/>
           </w:tcPr>
           <w:p>
@@ -1832,7 +1987,7 @@
               </w:rPr>
               <w:drawing>
                 <wp:inline xmlns:a="http://schemas.openxmlformats.org/drawingml/2006/main" xmlns:pic="http://schemas.openxmlformats.org/drawingml/2006/picture">
-                  <wp:extent cx="3081701" cy="5478580"/>
+                  <wp:extent cx="4697718" cy="8351499"/>
                   <wp:docPr id="5" name="Picture 5"/>
                   <wp:cNvGraphicFramePr>
                     <a:graphicFrameLocks noChangeAspect="1"/>
@@ -1853,7 +2008,7 @@
                         <pic:spPr>
                           <a:xfrm>
                             <a:off x="0" y="0"/>
-                            <a:ext cx="3081701" cy="5478580"/>
+                            <a:ext cx="4697718" cy="8351499"/>
                           </a:xfrm>
                           <a:prstGeom prst="rect"/>
                         </pic:spPr>
@@ -1866,50 +2021,113 @@
           </w:p>
           <w:p>
             <w:pPr>
-              <w:spacing w:before="0" w:after="20" w:line="204" w:lineRule="exact"/>
+              <w:spacing w:before="0" w:after="20" w:line="216" w:lineRule="exact"/>
             </w:pPr>
             <w:r>
               <w:rPr>
                 <w:b w:val="0"/>
                 <w:i w:val="0"/>
                 <w:color w:val="666666"/>
-                <w:sz w:val="17"/>
+                <w:sz w:val="18"/>
               </w:rPr>
               <w:t>PASO 5 · ESPECIFICACIONES TÉCNICAS · 01:21</w:t>
             </w:r>
           </w:p>
           <w:p>
             <w:pPr>
-              <w:spacing w:before="0" w:after="20" w:line="312" w:lineRule="exact"/>
+              <w:spacing w:before="0" w:after="20" w:line="360" w:lineRule="exact"/>
             </w:pPr>
             <w:r>
               <w:rPr>
                 <w:b/>
                 <w:i w:val="0"/>
                 <w:color w:val="111111"/>
-                <w:sz w:val="26"/>
+                <w:sz w:val="30"/>
               </w:rPr>
               <w:t>Mencionar parámetros de rotación y tubo</w:t>
             </w:r>
           </w:p>
           <w:p>
             <w:pPr>
-              <w:spacing w:before="0" w:after="0" w:line="252" w:lineRule="exact"/>
+              <w:spacing w:before="0" w:after="0" w:line="276" w:lineRule="exact"/>
             </w:pPr>
             <w:r>
               <w:rPr>
                 <w:b w:val="0"/>
                 <w:i w:val="0"/>
                 <w:color w:val="222222"/>
-                <w:sz w:val="21"/>
+                <w:sz w:val="23"/>
               </w:rPr>
               <w:t>Se indica que el equipo realiza una rotación en hasta 0,4 segundos, posee un tubo de 7,5 MHU y un generador de 72 kW que permite hasta 500-600 mA.</w:t>
             </w:r>
           </w:p>
         </w:tc>
+      </w:tr>
+    </w:tbl>
+    <w:p>
+      <w:pPr>
+        <w:sectPr>
+          <w:pgSz w:w="11906" w:h="16838"/>
+          <w:pgMar w:top="567" w:right="567" w:bottom="567" w:left="567" w:header="283" w:footer="283" w:gutter="0"/>
+          <w:cols w:space="720"/>
+          <w:docGrid w:linePitch="360"/>
+        </w:sectPr>
+      </w:pPr>
+    </w:p>
+    <w:p>
+      <w:pPr>
+        <w:pageBreakBefore w:val="0"/>
+        <w:pBdr>
+          <w:bottom w:val="single" w:sz="4" w:space="2" w:color="BBBBBB"/>
+        </w:pBdr>
+        <w:tabs>
+          <w:tab w:pos="10772" w:val="right"/>
+        </w:tabs>
+        <w:spacing w:before="0" w:after="80" w:line="192" w:lineRule="exact"/>
+      </w:pPr>
+      <w:r>
+        <w:rPr>
+          <w:b w:val="0"/>
+          <w:i w:val="0"/>
+          <w:color w:val="666666"/>
+          <w:sz w:val="16"/>
+        </w:rPr>
+        <w:t>Introducción y especificaciones del Aquilion Exceed LB</w:t>
+      </w:r>
+      <w:r>
+        <w:rPr>
+          <w:b w:val="0"/>
+          <w:i w:val="0"/>
+          <w:color w:val="666666"/>
+          <w:sz w:val="16"/>
+        </w:rPr>
+        <w:tab/>
+        <w:t>Paso 6 de 16</w:t>
+      </w:r>
+    </w:p>
+    <w:tbl>
+      <w:tblPr>
+        <w:tblW w:type="auto" w:w="0"/>
+        <w:jc w:val="center"/>
+        <w:tblLayout w:type="fixed"/>
+        <w:tblCellMar>
+          <w:top w:w="28" w:type="dxa"/>
+          <w:left w:w="85" w:type="dxa"/>
+          <w:bottom w:w="0" w:type="dxa"/>
+          <w:right w:w="85" w:type="dxa"/>
+        </w:tblCellMar>
+        <w:tblLook w:firstColumn="1" w:firstRow="1" w:lastColumn="0" w:lastRow="0" w:noHBand="0" w:noVBand="1" w:val="04A0"/>
+      </w:tblPr>
+      <w:tblGrid>
+        <w:gridCol w:w="10772"/>
+      </w:tblGrid>
+      <w:tr>
+        <w:trPr>
+          <w:trHeight w:val="15080" w:hRule="exact"/>
+        </w:trPr>
         <w:tc>
           <w:tcPr>
-            <w:tcW w:type="dxa" w:w="7710"/>
+            <w:tcW w:type="dxa" w:w="10772"/>
             <w:vAlign w:val="top"/>
           </w:tcPr>
           <w:p>
@@ -1926,7 +2144,7 @@
               </w:rPr>
               <w:drawing>
                 <wp:inline xmlns:a="http://schemas.openxmlformats.org/drawingml/2006/main" xmlns:pic="http://schemas.openxmlformats.org/drawingml/2006/picture">
-                  <wp:extent cx="3081701" cy="5478580"/>
+                  <wp:extent cx="4697718" cy="8351499"/>
                   <wp:docPr id="6" name="Picture 6"/>
                   <wp:cNvGraphicFramePr>
                     <a:graphicFrameLocks noChangeAspect="1"/>
@@ -1947,7 +2165,7 @@
                         <pic:spPr>
                           <a:xfrm>
                             <a:off x="0" y="0"/>
-                            <a:ext cx="3081701" cy="5478580"/>
+                            <a:ext cx="4697718" cy="8351499"/>
                           </a:xfrm>
                           <a:prstGeom prst="rect"/>
                         </pic:spPr>
@@ -1960,42 +2178,42 @@
           </w:p>
           <w:p>
             <w:pPr>
-              <w:spacing w:before="0" w:after="20" w:line="204" w:lineRule="exact"/>
+              <w:spacing w:before="0" w:after="20" w:line="216" w:lineRule="exact"/>
             </w:pPr>
             <w:r>
               <w:rPr>
                 <w:b w:val="0"/>
                 <w:i w:val="0"/>
                 <w:color w:val="666666"/>
-                <w:sz w:val="17"/>
+                <w:sz w:val="18"/>
               </w:rPr>
               <w:t>PASO 6 · REQUISITOS DE INSTALACIÓN · 01:54</w:t>
             </w:r>
           </w:p>
           <w:p>
             <w:pPr>
-              <w:spacing w:before="0" w:after="20" w:line="312" w:lineRule="exact"/>
+              <w:spacing w:before="0" w:after="20" w:line="360" w:lineRule="exact"/>
             </w:pPr>
             <w:r>
               <w:rPr>
                 <w:b/>
                 <w:i w:val="0"/>
                 <w:color w:val="111111"/>
-                <w:sz w:val="26"/>
+                <w:sz w:val="30"/>
               </w:rPr>
               <w:t>Advertir sobre el aire acondicionado</w:t>
             </w:r>
           </w:p>
           <w:p>
             <w:pPr>
-              <w:spacing w:before="0" w:after="0" w:line="252" w:lineRule="exact"/>
+              <w:spacing w:before="0" w:after="0" w:line="276" w:lineRule="exact"/>
             </w:pPr>
             <w:r>
               <w:rPr>
                 <w:b w:val="0"/>
                 <w:i w:val="0"/>
                 <w:color w:val="222222"/>
-                <w:sz w:val="21"/>
+                <w:sz w:val="23"/>
               </w:rPr>
               <w:t>Es obligatorio contar con aire acondicionado funcionando para enfriar la electrónica y el intercambiador de calor del tubo. Si falla, se debe apagar el equipo.</w:t>
             </w:r>
@@ -2005,12 +2223,22 @@
     </w:tbl>
     <w:p>
       <w:pPr>
-        <w:pageBreakBefore/>
+        <w:sectPr>
+          <w:pgSz w:w="11906" w:h="16838"/>
+          <w:pgMar w:top="567" w:right="567" w:bottom="567" w:left="567" w:header="283" w:footer="283" w:gutter="0"/>
+          <w:cols w:space="720"/>
+          <w:docGrid w:linePitch="360"/>
+        </w:sectPr>
+      </w:pPr>
+    </w:p>
+    <w:p>
+      <w:pPr>
+        <w:pageBreakBefore w:val="0"/>
         <w:pBdr>
           <w:bottom w:val="single" w:sz="4" w:space="2" w:color="BBBBBB"/>
         </w:pBdr>
         <w:tabs>
-          <w:tab w:pos="15704" w:val="right"/>
+          <w:tab w:pos="10772" w:val="right"/>
         </w:tabs>
         <w:spacing w:before="0" w:after="80" w:line="192" w:lineRule="exact"/>
       </w:pPr>
@@ -2031,7 +2259,7 @@
           <w:sz w:val="16"/>
         </w:rPr>
         <w:tab/>
-        <w:t>Pasos 7–8 de 16</w:t>
+        <w:t>Paso 7 de 16</w:t>
       </w:r>
     </w:p>
     <w:tbl>
@@ -2048,16 +2276,15 @@
         <w:tblLook w:firstColumn="1" w:firstRow="1" w:lastColumn="0" w:lastRow="0" w:noHBand="0" w:noVBand="1" w:val="04A0"/>
       </w:tblPr>
       <w:tblGrid>
-        <w:gridCol w:w="7852"/>
-        <w:gridCol w:w="7852"/>
+        <w:gridCol w:w="10772"/>
       </w:tblGrid>
       <w:tr>
         <w:trPr>
-          <w:trHeight w:val="10148" w:hRule="exact"/>
+          <w:trHeight w:val="15080" w:hRule="exact"/>
         </w:trPr>
         <w:tc>
           <w:tcPr>
-            <w:tcW w:type="dxa" w:w="7710"/>
+            <w:tcW w:type="dxa" w:w="10772"/>
             <w:vAlign w:val="top"/>
           </w:tcPr>
           <w:p>
@@ -2074,7 +2301,7 @@
               </w:rPr>
               <w:drawing>
                 <wp:inline xmlns:a="http://schemas.openxmlformats.org/drawingml/2006/main" xmlns:pic="http://schemas.openxmlformats.org/drawingml/2006/picture">
-                  <wp:extent cx="3081701" cy="5478580"/>
+                  <wp:extent cx="4697718" cy="8351499"/>
                   <wp:docPr id="7" name="Picture 7"/>
                   <wp:cNvGraphicFramePr>
                     <a:graphicFrameLocks noChangeAspect="1"/>
@@ -2095,7 +2322,7 @@
                         <pic:spPr>
                           <a:xfrm>
                             <a:off x="0" y="0"/>
-                            <a:ext cx="3081701" cy="5478580"/>
+                            <a:ext cx="4697718" cy="8351499"/>
                           </a:xfrm>
                           <a:prstGeom prst="rect"/>
                         </pic:spPr>
@@ -2108,50 +2335,113 @@
           </w:p>
           <w:p>
             <w:pPr>
-              <w:spacing w:before="0" w:after="20" w:line="204" w:lineRule="exact"/>
+              <w:spacing w:before="0" w:after="20" w:line="216" w:lineRule="exact"/>
             </w:pPr>
             <w:r>
               <w:rPr>
                 <w:b w:val="0"/>
                 <w:i w:val="0"/>
                 <w:color w:val="666666"/>
-                <w:sz w:val="17"/>
+                <w:sz w:val="18"/>
               </w:rPr>
               <w:t>PASO 7 · REQUISITOS DE INSTALACIÓN · 02:30</w:t>
             </w:r>
           </w:p>
           <w:p>
             <w:pPr>
-              <w:spacing w:before="0" w:after="20" w:line="312" w:lineRule="exact"/>
+              <w:spacing w:before="0" w:after="20" w:line="360" w:lineRule="exact"/>
             </w:pPr>
             <w:r>
               <w:rPr>
                 <w:b/>
                 <w:i w:val="0"/>
                 <w:color w:val="111111"/>
-                <w:sz w:val="26"/>
+                <w:sz w:val="30"/>
               </w:rPr>
               <w:t>Recomendar la temperatura de la sala</w:t>
             </w:r>
           </w:p>
           <w:p>
             <w:pPr>
-              <w:spacing w:before="0" w:after="0" w:line="252" w:lineRule="exact"/>
+              <w:spacing w:before="0" w:after="0" w:line="276" w:lineRule="exact"/>
             </w:pPr>
             <w:r>
               <w:rPr>
                 <w:b w:val="0"/>
                 <w:i w:val="0"/>
                 <w:color w:val="222222"/>
-                <w:sz w:val="21"/>
+                <w:sz w:val="23"/>
               </w:rPr>
               <w:t>Se aconseja mantener una temperatura constante de entre 22 y 23 grados Celsius dentro de la sala de examen.</w:t>
             </w:r>
           </w:p>
         </w:tc>
+      </w:tr>
+    </w:tbl>
+    <w:p>
+      <w:pPr>
+        <w:sectPr>
+          <w:pgSz w:w="11906" w:h="16838"/>
+          <w:pgMar w:top="567" w:right="567" w:bottom="567" w:left="567" w:header="283" w:footer="283" w:gutter="0"/>
+          <w:cols w:space="720"/>
+          <w:docGrid w:linePitch="360"/>
+        </w:sectPr>
+      </w:pPr>
+    </w:p>
+    <w:p>
+      <w:pPr>
+        <w:pageBreakBefore w:val="0"/>
+        <w:pBdr>
+          <w:bottom w:val="single" w:sz="4" w:space="2" w:color="BBBBBB"/>
+        </w:pBdr>
+        <w:tabs>
+          <w:tab w:pos="10772" w:val="right"/>
+        </w:tabs>
+        <w:spacing w:before="0" w:after="80" w:line="192" w:lineRule="exact"/>
+      </w:pPr>
+      <w:r>
+        <w:rPr>
+          <w:b w:val="0"/>
+          <w:i w:val="0"/>
+          <w:color w:val="666666"/>
+          <w:sz w:val="16"/>
+        </w:rPr>
+        <w:t>Introducción y especificaciones del Aquilion Exceed LB</w:t>
+      </w:r>
+      <w:r>
+        <w:rPr>
+          <w:b w:val="0"/>
+          <w:i w:val="0"/>
+          <w:color w:val="666666"/>
+          <w:sz w:val="16"/>
+        </w:rPr>
+        <w:tab/>
+        <w:t>Paso 8 de 16</w:t>
+      </w:r>
+    </w:p>
+    <w:tbl>
+      <w:tblPr>
+        <w:tblW w:type="auto" w:w="0"/>
+        <w:jc w:val="center"/>
+        <w:tblLayout w:type="fixed"/>
+        <w:tblCellMar>
+          <w:top w:w="28" w:type="dxa"/>
+          <w:left w:w="85" w:type="dxa"/>
+          <w:bottom w:w="0" w:type="dxa"/>
+          <w:right w:w="85" w:type="dxa"/>
+        </w:tblCellMar>
+        <w:tblLook w:firstColumn="1" w:firstRow="1" w:lastColumn="0" w:lastRow="0" w:noHBand="0" w:noVBand="1" w:val="04A0"/>
+      </w:tblPr>
+      <w:tblGrid>
+        <w:gridCol w:w="10772"/>
+      </w:tblGrid>
+      <w:tr>
+        <w:trPr>
+          <w:trHeight w:val="15080" w:hRule="exact"/>
+        </w:trPr>
         <w:tc>
           <w:tcPr>
-            <w:tcW w:type="dxa" w:w="7710"/>
+            <w:tcW w:type="dxa" w:w="10772"/>
             <w:vAlign w:val="top"/>
           </w:tcPr>
           <w:p>
@@ -2168,7 +2458,7 @@
               </w:rPr>
               <w:drawing>
                 <wp:inline xmlns:a="http://schemas.openxmlformats.org/drawingml/2006/main" xmlns:pic="http://schemas.openxmlformats.org/drawingml/2006/picture">
-                  <wp:extent cx="3081701" cy="5478580"/>
+                  <wp:extent cx="4697718" cy="8351499"/>
                   <wp:docPr id="8" name="Picture 8"/>
                   <wp:cNvGraphicFramePr>
                     <a:graphicFrameLocks noChangeAspect="1"/>
@@ -2189,7 +2479,7 @@
                         <pic:spPr>
                           <a:xfrm>
                             <a:off x="0" y="0"/>
-                            <a:ext cx="3081701" cy="5478580"/>
+                            <a:ext cx="4697718" cy="8351499"/>
                           </a:xfrm>
                           <a:prstGeom prst="rect"/>
                         </pic:spPr>
@@ -2202,42 +2492,42 @@
           </w:p>
           <w:p>
             <w:pPr>
-              <w:spacing w:before="0" w:after="20" w:line="204" w:lineRule="exact"/>
+              <w:spacing w:before="0" w:after="20" w:line="216" w:lineRule="exact"/>
             </w:pPr>
             <w:r>
               <w:rPr>
                 <w:b w:val="0"/>
                 <w:i w:val="0"/>
                 <w:color w:val="666666"/>
-                <w:sz w:val="17"/>
+                <w:sz w:val="18"/>
               </w:rPr>
               <w:t>PASO 8 · SISTEMA ELÉCTRICO · 02:51</w:t>
             </w:r>
           </w:p>
           <w:p>
             <w:pPr>
-              <w:spacing w:before="0" w:after="20" w:line="312" w:lineRule="exact"/>
+              <w:spacing w:before="0" w:after="20" w:line="360" w:lineRule="exact"/>
             </w:pPr>
             <w:r>
               <w:rPr>
                 <w:b/>
                 <w:i w:val="0"/>
                 <w:color w:val="111111"/>
-                <w:sz w:val="26"/>
+                <w:sz w:val="30"/>
               </w:rPr>
               <w:t>Mostrar los componentes eléctricos</w:t>
             </w:r>
           </w:p>
           <w:p>
             <w:pPr>
-              <w:spacing w:before="0" w:after="0" w:line="252" w:lineRule="exact"/>
+              <w:spacing w:before="0" w:after="0" w:line="276" w:lineRule="exact"/>
             </w:pPr>
             <w:r>
               <w:rPr>
                 <w:b w:val="0"/>
                 <w:i w:val="0"/>
                 <w:color w:val="222222"/>
-                <w:sz w:val="21"/>
+                <w:sz w:val="23"/>
               </w:rPr>
               <w:t>El instructor señala hacia la parte posterior de la sala los componentes eléctricos clave del sistema.</w:t>
             </w:r>
@@ -2247,12 +2537,22 @@
     </w:tbl>
     <w:p>
       <w:pPr>
-        <w:pageBreakBefore/>
+        <w:sectPr>
+          <w:pgSz w:w="11906" w:h="16838"/>
+          <w:pgMar w:top="567" w:right="567" w:bottom="567" w:left="567" w:header="283" w:footer="283" w:gutter="0"/>
+          <w:cols w:space="720"/>
+          <w:docGrid w:linePitch="360"/>
+        </w:sectPr>
+      </w:pPr>
+    </w:p>
+    <w:p>
+      <w:pPr>
+        <w:pageBreakBefore w:val="0"/>
         <w:pBdr>
           <w:bottom w:val="single" w:sz="4" w:space="2" w:color="BBBBBB"/>
         </w:pBdr>
         <w:tabs>
-          <w:tab w:pos="15704" w:val="right"/>
+          <w:tab w:pos="10772" w:val="right"/>
         </w:tabs>
         <w:spacing w:before="0" w:after="80" w:line="192" w:lineRule="exact"/>
       </w:pPr>
@@ -2273,7 +2573,7 @@
           <w:sz w:val="16"/>
         </w:rPr>
         <w:tab/>
-        <w:t>Pasos 9–10 de 16</w:t>
+        <w:t>Paso 9 de 16</w:t>
       </w:r>
     </w:p>
     <w:tbl>
@@ -2290,16 +2590,15 @@
         <w:tblLook w:firstColumn="1" w:firstRow="1" w:lastColumn="0" w:lastRow="0" w:noHBand="0" w:noVBand="1" w:val="04A0"/>
       </w:tblPr>
       <w:tblGrid>
-        <w:gridCol w:w="7852"/>
-        <w:gridCol w:w="7852"/>
+        <w:gridCol w:w="10772"/>
       </w:tblGrid>
       <w:tr>
         <w:trPr>
-          <w:trHeight w:val="10148" w:hRule="exact"/>
+          <w:trHeight w:val="15080" w:hRule="exact"/>
         </w:trPr>
         <w:tc>
           <w:tcPr>
-            <w:tcW w:type="dxa" w:w="7710"/>
+            <w:tcW w:type="dxa" w:w="10772"/>
             <w:vAlign w:val="top"/>
           </w:tcPr>
           <w:p>
@@ -2316,7 +2615,7 @@
               </w:rPr>
               <w:drawing>
                 <wp:inline xmlns:a="http://schemas.openxmlformats.org/drawingml/2006/main" xmlns:pic="http://schemas.openxmlformats.org/drawingml/2006/picture">
-                  <wp:extent cx="3081701" cy="5478580"/>
+                  <wp:extent cx="4697718" cy="8351499"/>
                   <wp:docPr id="9" name="Picture 9"/>
                   <wp:cNvGraphicFramePr>
                     <a:graphicFrameLocks noChangeAspect="1"/>
@@ -2337,7 +2636,7 @@
                         <pic:spPr>
                           <a:xfrm>
                             <a:off x="0" y="0"/>
-                            <a:ext cx="3081701" cy="5478580"/>
+                            <a:ext cx="4697718" cy="8351499"/>
                           </a:xfrm>
                           <a:prstGeom prst="rect"/>
                         </pic:spPr>
@@ -2350,50 +2649,113 @@
           </w:p>
           <w:p>
             <w:pPr>
-              <w:spacing w:before="0" w:after="20" w:line="204" w:lineRule="exact"/>
+              <w:spacing w:before="0" w:after="20" w:line="216" w:lineRule="exact"/>
             </w:pPr>
             <w:r>
               <w:rPr>
                 <w:b w:val="0"/>
                 <w:i w:val="0"/>
                 <w:color w:val="666666"/>
-                <w:sz w:val="17"/>
+                <w:sz w:val="18"/>
               </w:rPr>
               <w:t>PASO 9 · SISTEMA ELÉCTRICO · 03:30</w:t>
             </w:r>
           </w:p>
           <w:p>
             <w:pPr>
-              <w:spacing w:before="0" w:after="20" w:line="312" w:lineRule="exact"/>
+              <w:spacing w:before="0" w:after="20" w:line="360" w:lineRule="exact"/>
             </w:pPr>
             <w:r>
               <w:rPr>
                 <w:b/>
                 <w:i w:val="0"/>
                 <w:color w:val="111111"/>
-                <w:sz w:val="26"/>
+                <w:sz w:val="30"/>
               </w:rPr>
               <w:t>Explicar el propósito del UPS</w:t>
             </w:r>
           </w:p>
           <w:p>
             <w:pPr>
-              <w:spacing w:before="0" w:after="0" w:line="252" w:lineRule="exact"/>
+              <w:spacing w:before="0" w:after="0" w:line="276" w:lineRule="exact"/>
             </w:pPr>
             <w:r>
               <w:rPr>
                 <w:b w:val="0"/>
                 <w:i w:val="0"/>
                 <w:color w:val="222222"/>
-                <w:sz w:val="21"/>
+                <w:sz w:val="23"/>
               </w:rPr>
               <w:t>En caso de corte de suministro eléctrico prolongado, la función principal de la UPS es dar tiempo para apagar el sistema de forma correcta vía software.</w:t>
             </w:r>
           </w:p>
         </w:tc>
+      </w:tr>
+    </w:tbl>
+    <w:p>
+      <w:pPr>
+        <w:sectPr>
+          <w:pgSz w:w="11906" w:h="16838"/>
+          <w:pgMar w:top="567" w:right="567" w:bottom="567" w:left="567" w:header="283" w:footer="283" w:gutter="0"/>
+          <w:cols w:space="720"/>
+          <w:docGrid w:linePitch="360"/>
+        </w:sectPr>
+      </w:pPr>
+    </w:p>
+    <w:p>
+      <w:pPr>
+        <w:pageBreakBefore w:val="0"/>
+        <w:pBdr>
+          <w:bottom w:val="single" w:sz="4" w:space="2" w:color="BBBBBB"/>
+        </w:pBdr>
+        <w:tabs>
+          <w:tab w:pos="10772" w:val="right"/>
+        </w:tabs>
+        <w:spacing w:before="0" w:after="80" w:line="192" w:lineRule="exact"/>
+      </w:pPr>
+      <w:r>
+        <w:rPr>
+          <w:b w:val="0"/>
+          <w:i w:val="0"/>
+          <w:color w:val="666666"/>
+          <w:sz w:val="16"/>
+        </w:rPr>
+        <w:t>Introducción y especificaciones del Aquilion Exceed LB</w:t>
+      </w:r>
+      <w:r>
+        <w:rPr>
+          <w:b w:val="0"/>
+          <w:i w:val="0"/>
+          <w:color w:val="666666"/>
+          <w:sz w:val="16"/>
+        </w:rPr>
+        <w:tab/>
+        <w:t>Paso 10 de 16</w:t>
+      </w:r>
+    </w:p>
+    <w:tbl>
+      <w:tblPr>
+        <w:tblW w:type="auto" w:w="0"/>
+        <w:jc w:val="center"/>
+        <w:tblLayout w:type="fixed"/>
+        <w:tblCellMar>
+          <w:top w:w="28" w:type="dxa"/>
+          <w:left w:w="85" w:type="dxa"/>
+          <w:bottom w:w="0" w:type="dxa"/>
+          <w:right w:w="85" w:type="dxa"/>
+        </w:tblCellMar>
+        <w:tblLook w:firstColumn="1" w:firstRow="1" w:lastColumn="0" w:lastRow="0" w:noHBand="0" w:noVBand="1" w:val="04A0"/>
+      </w:tblPr>
+      <w:tblGrid>
+        <w:gridCol w:w="10772"/>
+      </w:tblGrid>
+      <w:tr>
+        <w:trPr>
+          <w:trHeight w:val="15080" w:hRule="exact"/>
+        </w:trPr>
         <w:tc>
           <w:tcPr>
-            <w:tcW w:type="dxa" w:w="7710"/>
+            <w:tcW w:type="dxa" w:w="10772"/>
             <w:vAlign w:val="top"/>
           </w:tcPr>
           <w:p>
@@ -2410,7 +2772,7 @@
               </w:rPr>
               <w:drawing>
                 <wp:inline xmlns:a="http://schemas.openxmlformats.org/drawingml/2006/main" xmlns:pic="http://schemas.openxmlformats.org/drawingml/2006/picture">
-                  <wp:extent cx="3081701" cy="5478580"/>
+                  <wp:extent cx="4697718" cy="8351499"/>
                   <wp:docPr id="10" name="Picture 10"/>
                   <wp:cNvGraphicFramePr>
                     <a:graphicFrameLocks noChangeAspect="1"/>
@@ -2431,7 +2793,7 @@
                         <pic:spPr>
                           <a:xfrm>
                             <a:off x="0" y="0"/>
-                            <a:ext cx="3081701" cy="5478580"/>
+                            <a:ext cx="4697718" cy="8351499"/>
                           </a:xfrm>
                           <a:prstGeom prst="rect"/>
                         </pic:spPr>
@@ -2444,42 +2806,42 @@
           </w:p>
           <w:p>
             <w:pPr>
-              <w:spacing w:before="0" w:after="20" w:line="204" w:lineRule="exact"/>
+              <w:spacing w:before="0" w:after="20" w:line="216" w:lineRule="exact"/>
             </w:pPr>
             <w:r>
               <w:rPr>
                 <w:b w:val="0"/>
                 <w:i w:val="0"/>
                 <w:color w:val="666666"/>
-                <w:sz w:val="17"/>
+                <w:sz w:val="18"/>
               </w:rPr>
               <w:t>PASO 10 · ENCENDIDO · 04:09</w:t>
             </w:r>
           </w:p>
           <w:p>
             <w:pPr>
-              <w:spacing w:before="0" w:after="20" w:line="312" w:lineRule="exact"/>
+              <w:spacing w:before="0" w:after="20" w:line="360" w:lineRule="exact"/>
             </w:pPr>
             <w:r>
               <w:rPr>
                 <w:b/>
                 <w:i w:val="0"/>
                 <w:color w:val="111111"/>
-                <w:sz w:val="26"/>
+                <w:sz w:val="30"/>
               </w:rPr>
               <w:t>Ubicar el tablero de encendido general</w:t>
             </w:r>
           </w:p>
           <w:p>
             <w:pPr>
-              <w:spacing w:before="0" w:after="0" w:line="252" w:lineRule="exact"/>
+              <w:spacing w:before="0" w:after="0" w:line="276" w:lineRule="exact"/>
             </w:pPr>
             <w:r>
               <w:rPr>
                 <w:b w:val="0"/>
                 <w:i w:val="0"/>
                 <w:color w:val="222222"/>
-                <w:sz w:val="21"/>
+                <w:sz w:val="23"/>
               </w:rPr>
               <w:t>El instructor señala el gabinete que contiene el disyuntor automático general y los pulsadores de encendido y apagado.</w:t>
             </w:r>
@@ -2489,12 +2851,22 @@
     </w:tbl>
     <w:p>
       <w:pPr>
-        <w:pageBreakBefore/>
+        <w:sectPr>
+          <w:pgSz w:w="11906" w:h="16838"/>
+          <w:pgMar w:top="567" w:right="567" w:bottom="567" w:left="567" w:header="283" w:footer="283" w:gutter="0"/>
+          <w:cols w:space="720"/>
+          <w:docGrid w:linePitch="360"/>
+        </w:sectPr>
+      </w:pPr>
+    </w:p>
+    <w:p>
+      <w:pPr>
+        <w:pageBreakBefore w:val="0"/>
         <w:pBdr>
           <w:bottom w:val="single" w:sz="4" w:space="2" w:color="BBBBBB"/>
         </w:pBdr>
         <w:tabs>
-          <w:tab w:pos="15704" w:val="right"/>
+          <w:tab w:pos="10772" w:val="right"/>
         </w:tabs>
         <w:spacing w:before="0" w:after="80" w:line="192" w:lineRule="exact"/>
       </w:pPr>
@@ -2515,7 +2887,7 @@
           <w:sz w:val="16"/>
         </w:rPr>
         <w:tab/>
-        <w:t>Pasos 11–12 de 16</w:t>
+        <w:t>Paso 11 de 16</w:t>
       </w:r>
     </w:p>
     <w:tbl>
@@ -2532,16 +2904,15 @@
         <w:tblLook w:firstColumn="1" w:firstRow="1" w:lastColumn="0" w:lastRow="0" w:noHBand="0" w:noVBand="1" w:val="04A0"/>
       </w:tblPr>
       <w:tblGrid>
-        <w:gridCol w:w="7852"/>
-        <w:gridCol w:w="7852"/>
+        <w:gridCol w:w="10772"/>
       </w:tblGrid>
       <w:tr>
         <w:trPr>
-          <w:trHeight w:val="10148" w:hRule="exact"/>
+          <w:trHeight w:val="15080" w:hRule="exact"/>
         </w:trPr>
         <w:tc>
           <w:tcPr>
-            <w:tcW w:type="dxa" w:w="7710"/>
+            <w:tcW w:type="dxa" w:w="10772"/>
             <w:vAlign w:val="top"/>
           </w:tcPr>
           <w:p>
@@ -2558,7 +2929,7 @@
               </w:rPr>
               <w:drawing>
                 <wp:inline xmlns:a="http://schemas.openxmlformats.org/drawingml/2006/main" xmlns:pic="http://schemas.openxmlformats.org/drawingml/2006/picture">
-                  <wp:extent cx="3081701" cy="5478580"/>
+                  <wp:extent cx="4697718" cy="8351499"/>
                   <wp:docPr id="11" name="Picture 11"/>
                   <wp:cNvGraphicFramePr>
                     <a:graphicFrameLocks noChangeAspect="1"/>
@@ -2579,7 +2950,7 @@
                         <pic:spPr>
                           <a:xfrm>
                             <a:off x="0" y="0"/>
-                            <a:ext cx="3081701" cy="5478580"/>
+                            <a:ext cx="4697718" cy="8351499"/>
                           </a:xfrm>
                           <a:prstGeom prst="rect"/>
                         </pic:spPr>
@@ -2592,50 +2963,113 @@
           </w:p>
           <w:p>
             <w:pPr>
-              <w:spacing w:before="0" w:after="20" w:line="204" w:lineRule="exact"/>
+              <w:spacing w:before="0" w:after="20" w:line="216" w:lineRule="exact"/>
             </w:pPr>
             <w:r>
               <w:rPr>
                 <w:b w:val="0"/>
                 <w:i w:val="0"/>
                 <w:color w:val="666666"/>
-                <w:sz w:val="17"/>
+                <w:sz w:val="18"/>
               </w:rPr>
               <w:t>PASO 11 · ENCENDIDO · 04:10</w:t>
             </w:r>
           </w:p>
           <w:p>
             <w:pPr>
-              <w:spacing w:before="0" w:after="20" w:line="312" w:lineRule="exact"/>
+              <w:spacing w:before="0" w:after="20" w:line="360" w:lineRule="exact"/>
             </w:pPr>
             <w:r>
               <w:rPr>
                 <w:b/>
                 <w:i w:val="0"/>
                 <w:color w:val="111111"/>
-                <w:sz w:val="26"/>
+                <w:sz w:val="30"/>
               </w:rPr>
               <w:t>Presionar el pulsador verde de encendido</w:t>
             </w:r>
           </w:p>
           <w:p>
             <w:pPr>
-              <w:spacing w:before="0" w:after="0" w:line="252" w:lineRule="exact"/>
+              <w:spacing w:before="0" w:after="0" w:line="276" w:lineRule="exact"/>
             </w:pPr>
             <w:r>
               <w:rPr>
                 <w:b w:val="0"/>
                 <w:i w:val="0"/>
                 <w:color w:val="222222"/>
-                <w:sz w:val="21"/>
+                <w:sz w:val="23"/>
               </w:rPr>
               <w:t>Para encender el sistema, presione el botón verde de encendido rotulado como Pulsador Encendido dentro del gabinete de control.</w:t>
             </w:r>
           </w:p>
         </w:tc>
+      </w:tr>
+    </w:tbl>
+    <w:p>
+      <w:pPr>
+        <w:sectPr>
+          <w:pgSz w:w="11906" w:h="16838"/>
+          <w:pgMar w:top="567" w:right="567" w:bottom="567" w:left="567" w:header="283" w:footer="283" w:gutter="0"/>
+          <w:cols w:space="720"/>
+          <w:docGrid w:linePitch="360"/>
+        </w:sectPr>
+      </w:pPr>
+    </w:p>
+    <w:p>
+      <w:pPr>
+        <w:pageBreakBefore w:val="0"/>
+        <w:pBdr>
+          <w:bottom w:val="single" w:sz="4" w:space="2" w:color="BBBBBB"/>
+        </w:pBdr>
+        <w:tabs>
+          <w:tab w:pos="10772" w:val="right"/>
+        </w:tabs>
+        <w:spacing w:before="0" w:after="80" w:line="192" w:lineRule="exact"/>
+      </w:pPr>
+      <w:r>
+        <w:rPr>
+          <w:b w:val="0"/>
+          <w:i w:val="0"/>
+          <w:color w:val="666666"/>
+          <w:sz w:val="16"/>
+        </w:rPr>
+        <w:t>Introducción y especificaciones del Aquilion Exceed LB</w:t>
+      </w:r>
+      <w:r>
+        <w:rPr>
+          <w:b w:val="0"/>
+          <w:i w:val="0"/>
+          <w:color w:val="666666"/>
+          <w:sz w:val="16"/>
+        </w:rPr>
+        <w:tab/>
+        <w:t>Paso 12 de 16</w:t>
+      </w:r>
+    </w:p>
+    <w:tbl>
+      <w:tblPr>
+        <w:tblW w:type="auto" w:w="0"/>
+        <w:jc w:val="center"/>
+        <w:tblLayout w:type="fixed"/>
+        <w:tblCellMar>
+          <w:top w:w="28" w:type="dxa"/>
+          <w:left w:w="85" w:type="dxa"/>
+          <w:bottom w:w="0" w:type="dxa"/>
+          <w:right w:w="85" w:type="dxa"/>
+        </w:tblCellMar>
+        <w:tblLook w:firstColumn="1" w:firstRow="1" w:lastColumn="0" w:lastRow="0" w:noHBand="0" w:noVBand="1" w:val="04A0"/>
+      </w:tblPr>
+      <w:tblGrid>
+        <w:gridCol w:w="10772"/>
+      </w:tblGrid>
+      <w:tr>
+        <w:trPr>
+          <w:trHeight w:val="15080" w:hRule="exact"/>
+        </w:trPr>
         <w:tc>
           <w:tcPr>
-            <w:tcW w:type="dxa" w:w="7710"/>
+            <w:tcW w:type="dxa" w:w="10772"/>
             <w:vAlign w:val="top"/>
           </w:tcPr>
           <w:p>
@@ -2652,7 +3086,7 @@
               </w:rPr>
               <w:drawing>
                 <wp:inline xmlns:a="http://schemas.openxmlformats.org/drawingml/2006/main" xmlns:pic="http://schemas.openxmlformats.org/drawingml/2006/picture">
-                  <wp:extent cx="3081701" cy="5478580"/>
+                  <wp:extent cx="4697718" cy="8351499"/>
                   <wp:docPr id="12" name="Picture 12"/>
                   <wp:cNvGraphicFramePr>
                     <a:graphicFrameLocks noChangeAspect="1"/>
@@ -2673,7 +3107,7 @@
                         <pic:spPr>
                           <a:xfrm>
                             <a:off x="0" y="0"/>
-                            <a:ext cx="3081701" cy="5478580"/>
+                            <a:ext cx="4697718" cy="8351499"/>
                           </a:xfrm>
                           <a:prstGeom prst="rect"/>
                         </pic:spPr>
@@ -2686,42 +3120,42 @@
           </w:p>
           <w:p>
             <w:pPr>
-              <w:spacing w:before="0" w:after="20" w:line="204" w:lineRule="exact"/>
+              <w:spacing w:before="0" w:after="20" w:line="216" w:lineRule="exact"/>
             </w:pPr>
             <w:r>
               <w:rPr>
                 <w:b w:val="0"/>
                 <w:i w:val="0"/>
                 <w:color w:val="666666"/>
-                <w:sz w:val="17"/>
+                <w:sz w:val="18"/>
               </w:rPr>
               <w:t>PASO 12 · ENCENDIDO · 04:21</w:t>
             </w:r>
           </w:p>
           <w:p>
             <w:pPr>
-              <w:spacing w:before="0" w:after="20" w:line="312" w:lineRule="exact"/>
+              <w:spacing w:before="0" w:after="20" w:line="360" w:lineRule="exact"/>
             </w:pPr>
             <w:r>
               <w:rPr>
                 <w:b/>
                 <w:i w:val="0"/>
                 <w:color w:val="111111"/>
-                <w:sz w:val="26"/>
+                <w:sz w:val="30"/>
               </w:rPr>
               <w:t>Verificar el disyuntor de arriba</w:t>
             </w:r>
           </w:p>
           <w:p>
             <w:pPr>
-              <w:spacing w:before="0" w:after="0" w:line="252" w:lineRule="exact"/>
+              <w:spacing w:before="0" w:after="0" w:line="276" w:lineRule="exact"/>
             </w:pPr>
             <w:r>
               <w:rPr>
                 <w:b w:val="0"/>
                 <w:i w:val="0"/>
                 <w:color w:val="222222"/>
-                <w:sz w:val="21"/>
+                <w:sz w:val="23"/>
               </w:rPr>
               <w:t>Asegúrese de que la llave térmica de Automático General esté en la posición de encendido (I) antes de pulsar el botón verde.</w:t>
             </w:r>
@@ -2731,12 +3165,22 @@
     </w:tbl>
     <w:p>
       <w:pPr>
-        <w:pageBreakBefore/>
+        <w:sectPr>
+          <w:pgSz w:w="11906" w:h="16838"/>
+          <w:pgMar w:top="567" w:right="567" w:bottom="567" w:left="567" w:header="283" w:footer="283" w:gutter="0"/>
+          <w:cols w:space="720"/>
+          <w:docGrid w:linePitch="360"/>
+        </w:sectPr>
+      </w:pPr>
+    </w:p>
+    <w:p>
+      <w:pPr>
+        <w:pageBreakBefore w:val="0"/>
         <w:pBdr>
           <w:bottom w:val="single" w:sz="4" w:space="2" w:color="BBBBBB"/>
         </w:pBdr>
         <w:tabs>
-          <w:tab w:pos="15704" w:val="right"/>
+          <w:tab w:pos="10772" w:val="right"/>
         </w:tabs>
         <w:spacing w:before="0" w:after="80" w:line="192" w:lineRule="exact"/>
       </w:pPr>
@@ -2757,7 +3201,7 @@
           <w:sz w:val="16"/>
         </w:rPr>
         <w:tab/>
-        <w:t>Pasos 13–14 de 16</w:t>
+        <w:t>Paso 13 de 16</w:t>
       </w:r>
     </w:p>
     <w:tbl>
@@ -2774,16 +3218,15 @@
         <w:tblLook w:firstColumn="1" w:firstRow="1" w:lastColumn="0" w:lastRow="0" w:noHBand="0" w:noVBand="1" w:val="04A0"/>
       </w:tblPr>
       <w:tblGrid>
-        <w:gridCol w:w="7852"/>
-        <w:gridCol w:w="7852"/>
+        <w:gridCol w:w="10772"/>
       </w:tblGrid>
       <w:tr>
         <w:trPr>
-          <w:trHeight w:val="10148" w:hRule="exact"/>
+          <w:trHeight w:val="15080" w:hRule="exact"/>
         </w:trPr>
         <w:tc>
           <w:tcPr>
-            <w:tcW w:type="dxa" w:w="7710"/>
+            <w:tcW w:type="dxa" w:w="10772"/>
             <w:vAlign w:val="top"/>
           </w:tcPr>
           <w:p>
@@ -2800,7 +3243,7 @@
               </w:rPr>
               <w:drawing>
                 <wp:inline xmlns:a="http://schemas.openxmlformats.org/drawingml/2006/main" xmlns:pic="http://schemas.openxmlformats.org/drawingml/2006/picture">
-                  <wp:extent cx="3081701" cy="5478580"/>
+                  <wp:extent cx="4697718" cy="8351499"/>
                   <wp:docPr id="13" name="Picture 13"/>
                   <wp:cNvGraphicFramePr>
                     <a:graphicFrameLocks noChangeAspect="1"/>
@@ -2821,7 +3264,7 @@
                         <pic:spPr>
                           <a:xfrm>
                             <a:off x="0" y="0"/>
-                            <a:ext cx="3081701" cy="5478580"/>
+                            <a:ext cx="4697718" cy="8351499"/>
                           </a:xfrm>
                           <a:prstGeom prst="rect"/>
                         </pic:spPr>
@@ -2834,50 +3277,113 @@
           </w:p>
           <w:p>
             <w:pPr>
-              <w:spacing w:before="0" w:after="20" w:line="204" w:lineRule="exact"/>
+              <w:spacing w:before="0" w:after="20" w:line="216" w:lineRule="exact"/>
             </w:pPr>
             <w:r>
               <w:rPr>
                 <w:b w:val="0"/>
                 <w:i w:val="0"/>
                 <w:color w:val="666666"/>
-                <w:sz w:val="17"/>
+                <w:sz w:val="18"/>
               </w:rPr>
               <w:t>PASO 13 · MANEJO DE UPS · 05:04</w:t>
             </w:r>
           </w:p>
           <w:p>
             <w:pPr>
-              <w:spacing w:before="0" w:after="20" w:line="312" w:lineRule="exact"/>
+              <w:spacing w:before="0" w:after="20" w:line="360" w:lineRule="exact"/>
             </w:pPr>
             <w:r>
               <w:rPr>
                 <w:b/>
                 <w:i w:val="0"/>
                 <w:color w:val="111111"/>
-                <w:sz w:val="26"/>
+                <w:sz w:val="30"/>
               </w:rPr>
               <w:t>Encender la pantalla touch de la UPS</w:t>
             </w:r>
           </w:p>
           <w:p>
             <w:pPr>
-              <w:spacing w:before="0" w:after="0" w:line="252" w:lineRule="exact"/>
+              <w:spacing w:before="0" w:after="0" w:line="276" w:lineRule="exact"/>
             </w:pPr>
             <w:r>
               <w:rPr>
                 <w:b w:val="0"/>
                 <w:i w:val="0"/>
                 <w:color w:val="222222"/>
-                <w:sz w:val="21"/>
+                <w:sz w:val="23"/>
               </w:rPr>
               <w:t>Al recibir energía, la pantalla de la UPS se activará mostrando un diagrama de flujo y estado de energía para proceder.</w:t>
             </w:r>
           </w:p>
         </w:tc>
+      </w:tr>
+    </w:tbl>
+    <w:p>
+      <w:pPr>
+        <w:sectPr>
+          <w:pgSz w:w="11906" w:h="16838"/>
+          <w:pgMar w:top="567" w:right="567" w:bottom="567" w:left="567" w:header="283" w:footer="283" w:gutter="0"/>
+          <w:cols w:space="720"/>
+          <w:docGrid w:linePitch="360"/>
+        </w:sectPr>
+      </w:pPr>
+    </w:p>
+    <w:p>
+      <w:pPr>
+        <w:pageBreakBefore w:val="0"/>
+        <w:pBdr>
+          <w:bottom w:val="single" w:sz="4" w:space="2" w:color="BBBBBB"/>
+        </w:pBdr>
+        <w:tabs>
+          <w:tab w:pos="10772" w:val="right"/>
+        </w:tabs>
+        <w:spacing w:before="0" w:after="80" w:line="192" w:lineRule="exact"/>
+      </w:pPr>
+      <w:r>
+        <w:rPr>
+          <w:b w:val="0"/>
+          <w:i w:val="0"/>
+          <w:color w:val="666666"/>
+          <w:sz w:val="16"/>
+        </w:rPr>
+        <w:t>Introducción y especificaciones del Aquilion Exceed LB</w:t>
+      </w:r>
+      <w:r>
+        <w:rPr>
+          <w:b w:val="0"/>
+          <w:i w:val="0"/>
+          <w:color w:val="666666"/>
+          <w:sz w:val="16"/>
+        </w:rPr>
+        <w:tab/>
+        <w:t>Paso 14 de 16</w:t>
+      </w:r>
+    </w:p>
+    <w:tbl>
+      <w:tblPr>
+        <w:tblW w:type="auto" w:w="0"/>
+        <w:jc w:val="center"/>
+        <w:tblLayout w:type="fixed"/>
+        <w:tblCellMar>
+          <w:top w:w="28" w:type="dxa"/>
+          <w:left w:w="85" w:type="dxa"/>
+          <w:bottom w:w="0" w:type="dxa"/>
+          <w:right w:w="85" w:type="dxa"/>
+        </w:tblCellMar>
+        <w:tblLook w:firstColumn="1" w:firstRow="1" w:lastColumn="0" w:lastRow="0" w:noHBand="0" w:noVBand="1" w:val="04A0"/>
+      </w:tblPr>
+      <w:tblGrid>
+        <w:gridCol w:w="10772"/>
+      </w:tblGrid>
+      <w:tr>
+        <w:trPr>
+          <w:trHeight w:val="15080" w:hRule="exact"/>
+        </w:trPr>
         <w:tc>
           <w:tcPr>
-            <w:tcW w:type="dxa" w:w="7710"/>
+            <w:tcW w:type="dxa" w:w="10772"/>
             <w:vAlign w:val="top"/>
           </w:tcPr>
           <w:p>
@@ -2894,7 +3400,7 @@
               </w:rPr>
               <w:drawing>
                 <wp:inline xmlns:a="http://schemas.openxmlformats.org/drawingml/2006/main" xmlns:pic="http://schemas.openxmlformats.org/drawingml/2006/picture">
-                  <wp:extent cx="3081701" cy="5478580"/>
+                  <wp:extent cx="4697718" cy="8351499"/>
                   <wp:docPr id="14" name="Picture 14"/>
                   <wp:cNvGraphicFramePr>
                     <a:graphicFrameLocks noChangeAspect="1"/>
@@ -2915,7 +3421,7 @@
                         <pic:spPr>
                           <a:xfrm>
                             <a:off x="0" y="0"/>
-                            <a:ext cx="3081701" cy="5478580"/>
+                            <a:ext cx="4697718" cy="8351499"/>
                           </a:xfrm>
                           <a:prstGeom prst="rect"/>
                         </pic:spPr>
@@ -2928,42 +3434,42 @@
           </w:p>
           <w:p>
             <w:pPr>
-              <w:spacing w:before="0" w:after="20" w:line="204" w:lineRule="exact"/>
+              <w:spacing w:before="0" w:after="20" w:line="216" w:lineRule="exact"/>
             </w:pPr>
             <w:r>
               <w:rPr>
                 <w:b w:val="0"/>
                 <w:i w:val="0"/>
                 <w:color w:val="666666"/>
-                <w:sz w:val="17"/>
+                <w:sz w:val="18"/>
               </w:rPr>
               <w:t>PASO 14 · MANEJO DE UPS · 06:11</w:t>
             </w:r>
           </w:p>
           <w:p>
             <w:pPr>
-              <w:spacing w:before="0" w:after="20" w:line="312" w:lineRule="exact"/>
+              <w:spacing w:before="0" w:after="20" w:line="360" w:lineRule="exact"/>
             </w:pPr>
             <w:r>
               <w:rPr>
                 <w:b/>
                 <w:i w:val="0"/>
                 <w:color w:val="111111"/>
-                <w:sz w:val="26"/>
+                <w:sz w:val="30"/>
               </w:rPr>
               <w:t>Puente de la UPS en caso de falla</w:t>
             </w:r>
           </w:p>
           <w:p>
             <w:pPr>
-              <w:spacing w:before="0" w:after="0" w:line="252" w:lineRule="exact"/>
+              <w:spacing w:before="0" w:after="0" w:line="276" w:lineRule="exact"/>
             </w:pPr>
             <w:r>
               <w:rPr>
                 <w:b w:val="0"/>
                 <w:i w:val="0"/>
                 <w:color w:val="222222"/>
-                <w:sz w:val="21"/>
+                <w:sz w:val="23"/>
               </w:rPr>
               <w:t>Si la UPS falla o se apaga por batería baja, desconecte los conectores industriales traseros y conéctelos directamente para saltar la UPS en emergencias.</w:t>
             </w:r>
@@ -2973,12 +3479,22 @@
     </w:tbl>
     <w:p>
       <w:pPr>
-        <w:pageBreakBefore/>
+        <w:sectPr>
+          <w:pgSz w:w="11906" w:h="16838"/>
+          <w:pgMar w:top="567" w:right="567" w:bottom="567" w:left="567" w:header="283" w:footer="283" w:gutter="0"/>
+          <w:cols w:space="720"/>
+          <w:docGrid w:linePitch="360"/>
+        </w:sectPr>
+      </w:pPr>
+    </w:p>
+    <w:p>
+      <w:pPr>
+        <w:pageBreakBefore w:val="0"/>
         <w:pBdr>
           <w:bottom w:val="single" w:sz="4" w:space="2" w:color="BBBBBB"/>
         </w:pBdr>
         <w:tabs>
-          <w:tab w:pos="15704" w:val="right"/>
+          <w:tab w:pos="10772" w:val="right"/>
         </w:tabs>
         <w:spacing w:before="0" w:after="80" w:line="192" w:lineRule="exact"/>
       </w:pPr>
@@ -2999,7 +3515,7 @@
           <w:sz w:val="16"/>
         </w:rPr>
         <w:tab/>
-        <w:t>Pasos 15–16 de 16</w:t>
+        <w:t>Paso 15 de 16</w:t>
       </w:r>
     </w:p>
     <w:tbl>
@@ -3016,16 +3532,15 @@
         <w:tblLook w:firstColumn="1" w:firstRow="1" w:lastColumn="0" w:lastRow="0" w:noHBand="0" w:noVBand="1" w:val="04A0"/>
       </w:tblPr>
       <w:tblGrid>
-        <w:gridCol w:w="7852"/>
-        <w:gridCol w:w="7852"/>
+        <w:gridCol w:w="10772"/>
       </w:tblGrid>
       <w:tr>
         <w:trPr>
-          <w:trHeight w:val="10148" w:hRule="exact"/>
+          <w:trHeight w:val="15080" w:hRule="exact"/>
         </w:trPr>
         <w:tc>
           <w:tcPr>
-            <w:tcW w:type="dxa" w:w="7710"/>
+            <w:tcW w:type="dxa" w:w="10772"/>
             <w:vAlign w:val="top"/>
           </w:tcPr>
           <w:p>
@@ -3042,7 +3557,7 @@
               </w:rPr>
               <w:drawing>
                 <wp:inline xmlns:a="http://schemas.openxmlformats.org/drawingml/2006/main" xmlns:pic="http://schemas.openxmlformats.org/drawingml/2006/picture">
-                  <wp:extent cx="3081701" cy="5478580"/>
+                  <wp:extent cx="4697718" cy="8351499"/>
                   <wp:docPr id="15" name="Picture 15"/>
                   <wp:cNvGraphicFramePr>
                     <a:graphicFrameLocks noChangeAspect="1"/>
@@ -3063,7 +3578,7 @@
                         <pic:spPr>
                           <a:xfrm>
                             <a:off x="0" y="0"/>
-                            <a:ext cx="3081701" cy="5478580"/>
+                            <a:ext cx="4697718" cy="8351499"/>
                           </a:xfrm>
                           <a:prstGeom prst="rect"/>
                         </pic:spPr>
@@ -3076,138 +3591,44 @@
           </w:p>
           <w:p>
             <w:pPr>
-              <w:spacing w:before="0" w:after="20" w:line="204" w:lineRule="exact"/>
+              <w:spacing w:before="0" w:after="20" w:line="216" w:lineRule="exact"/>
             </w:pPr>
             <w:r>
               <w:rPr>
                 <w:b w:val="0"/>
                 <w:i w:val="0"/>
                 <w:color w:val="666666"/>
-                <w:sz w:val="17"/>
+                <w:sz w:val="18"/>
               </w:rPr>
               <w:t>PASO 15 · APAGADO Y SEGURIDAD · 08:31</w:t>
             </w:r>
           </w:p>
           <w:p>
             <w:pPr>
-              <w:spacing w:before="0" w:after="20" w:line="312" w:lineRule="exact"/>
+              <w:spacing w:before="0" w:after="20" w:line="360" w:lineRule="exact"/>
             </w:pPr>
             <w:r>
               <w:rPr>
                 <w:b/>
                 <w:i w:val="0"/>
                 <w:color w:val="111111"/>
-                <w:sz w:val="26"/>
+                <w:sz w:val="30"/>
               </w:rPr>
               <w:t>Dejar enfriar el tubo antes de un corte</w:t>
             </w:r>
           </w:p>
           <w:p>
             <w:pPr>
-              <w:spacing w:before="0" w:after="0" w:line="252" w:lineRule="exact"/>
+              <w:spacing w:before="0" w:after="0" w:line="276" w:lineRule="exact"/>
             </w:pPr>
             <w:r>
               <w:rPr>
                 <w:b w:val="0"/>
                 <w:i w:val="0"/>
                 <w:color w:val="222222"/>
-                <w:sz w:val="21"/>
+                <w:sz w:val="23"/>
               </w:rPr>
               <w:t>En caso de corte de energía programado, realice el último paciente al menos una hora antes para permitir que el tubo se enfríe de manera segura.</w:t>
-            </w:r>
-          </w:p>
-        </w:tc>
-        <w:tc>
-          <w:tcPr>
-            <w:tcW w:type="dxa" w:w="7710"/>
-            <w:vAlign w:val="top"/>
-          </w:tcPr>
-          <w:p>
-            <w:pPr>
-              <w:spacing w:before="0" w:after="40" w:line="240" w:lineRule="auto"/>
-              <w:jc w:val="left"/>
-              <w:rPr>
-                <w:sz w:val="4"/>
-              </w:rPr>
-            </w:pPr>
-            <w:r>
-              <w:rPr>
-                <w:sz w:val="4"/>
-              </w:rPr>
-              <w:drawing>
-                <wp:inline xmlns:a="http://schemas.openxmlformats.org/drawingml/2006/main" xmlns:pic="http://schemas.openxmlformats.org/drawingml/2006/picture">
-                  <wp:extent cx="2991690" cy="5318560"/>
-                  <wp:docPr id="16" name="Picture 16"/>
-                  <wp:cNvGraphicFramePr>
-                    <a:graphicFrameLocks noChangeAspect="1"/>
-                  </wp:cNvGraphicFramePr>
-                  <a:graphic>
-                    <a:graphicData uri="http://schemas.openxmlformats.org/drawingml/2006/picture">
-                      <pic:pic>
-                        <pic:nvPicPr>
-                          <pic:cNvPr id="0" name="16_09-43_anotada.jpg"/>
-                          <pic:cNvPicPr/>
-                        </pic:nvPicPr>
-                        <pic:blipFill>
-                          <a:blip r:embed="rId25"/>
-                          <a:stretch>
-                            <a:fillRect/>
-                          </a:stretch>
-                        </pic:blipFill>
-                        <pic:spPr>
-                          <a:xfrm>
-                            <a:off x="0" y="0"/>
-                            <a:ext cx="2991690" cy="5318560"/>
-                          </a:xfrm>
-                          <a:prstGeom prst="rect"/>
-                        </pic:spPr>
-                      </pic:pic>
-                    </a:graphicData>
-                  </a:graphic>
-                </wp:inline>
-              </w:drawing>
-            </w:r>
-          </w:p>
-          <w:p>
-            <w:pPr>
-              <w:spacing w:before="0" w:after="20" w:line="204" w:lineRule="exact"/>
-            </w:pPr>
-            <w:r>
-              <w:rPr>
-                <w:b w:val="0"/>
-                <w:i w:val="0"/>
-                <w:color w:val="666666"/>
-                <w:sz w:val="17"/>
-              </w:rPr>
-              <w:t>PASO 16 · APAGADO Y SEGURIDAD · 09:43</w:t>
-            </w:r>
-          </w:p>
-          <w:p>
-            <w:pPr>
-              <w:spacing w:before="0" w:after="20" w:line="312" w:lineRule="exact"/>
-            </w:pPr>
-            <w:r>
-              <w:rPr>
-                <w:b/>
-                <w:i w:val="0"/>
-                <w:color w:val="111111"/>
-                <w:sz w:val="26"/>
-              </w:rPr>
-              <w:t>Estabilizar temperatura antes de operar</w:t>
-            </w:r>
-          </w:p>
-          <w:p>
-            <w:pPr>
-              <w:spacing w:before="0" w:after="0" w:line="252" w:lineRule="exact"/>
-            </w:pPr>
-            <w:r>
-              <w:rPr>
-                <w:b w:val="0"/>
-                <w:i w:val="0"/>
-                <w:color w:val="222222"/>
-                <w:sz w:val="21"/>
-              </w:rPr>
-              <w:t>Al restablecer la energía tras un corte largo, espere de 2 a 3 horas antes de realizar estudios para que la cámara de detectores alcance una temperatura estable y evitar artefactos en la imagen. El tomógrafo Canon Aquilion Exceed LB debe climatizarse.</w:t>
             </w:r>
           </w:p>
         </w:tc>
@@ -3215,12 +3636,22 @@
     </w:tbl>
     <w:p>
       <w:pPr>
-        <w:pageBreakBefore/>
+        <w:sectPr>
+          <w:pgSz w:w="11906" w:h="16838"/>
+          <w:pgMar w:top="567" w:right="567" w:bottom="567" w:left="567" w:header="283" w:footer="283" w:gutter="0"/>
+          <w:cols w:space="720"/>
+          <w:docGrid w:linePitch="360"/>
+        </w:sectPr>
+      </w:pPr>
+    </w:p>
+    <w:p>
+      <w:pPr>
+        <w:pageBreakBefore w:val="0"/>
         <w:pBdr>
           <w:bottom w:val="single" w:sz="4" w:space="2" w:color="BBBBBB"/>
         </w:pBdr>
         <w:tabs>
-          <w:tab w:pos="15704" w:val="right"/>
+          <w:tab w:pos="10772" w:val="right"/>
         </w:tabs>
         <w:spacing w:before="0" w:after="80" w:line="192" w:lineRule="exact"/>
       </w:pPr>
@@ -3241,7 +3672,164 @@
           <w:sz w:val="16"/>
         </w:rPr>
         <w:tab/>
-        <w:t>Transcripción (1 de 4)</w:t>
+        <w:t>Paso 16 de 16</w:t>
+      </w:r>
+    </w:p>
+    <w:tbl>
+      <w:tblPr>
+        <w:tblW w:type="auto" w:w="0"/>
+        <w:jc w:val="center"/>
+        <w:tblLayout w:type="fixed"/>
+        <w:tblCellMar>
+          <w:top w:w="28" w:type="dxa"/>
+          <w:left w:w="85" w:type="dxa"/>
+          <w:bottom w:w="0" w:type="dxa"/>
+          <w:right w:w="85" w:type="dxa"/>
+        </w:tblCellMar>
+        <w:tblLook w:firstColumn="1" w:firstRow="1" w:lastColumn="0" w:lastRow="0" w:noHBand="0" w:noVBand="1" w:val="04A0"/>
+      </w:tblPr>
+      <w:tblGrid>
+        <w:gridCol w:w="10772"/>
+      </w:tblGrid>
+      <w:tr>
+        <w:trPr>
+          <w:trHeight w:val="15080" w:hRule="exact"/>
+        </w:trPr>
+        <w:tc>
+          <w:tcPr>
+            <w:tcW w:type="dxa" w:w="10772"/>
+            <w:vAlign w:val="top"/>
+          </w:tcPr>
+          <w:p>
+            <w:pPr>
+              <w:spacing w:before="0" w:after="40" w:line="240" w:lineRule="auto"/>
+              <w:jc w:val="left"/>
+              <w:rPr>
+                <w:sz w:val="4"/>
+              </w:rPr>
+            </w:pPr>
+            <w:r>
+              <w:rPr>
+                <w:sz w:val="4"/>
+              </w:rPr>
+              <w:drawing>
+                <wp:inline xmlns:a="http://schemas.openxmlformats.org/drawingml/2006/main" xmlns:pic="http://schemas.openxmlformats.org/drawingml/2006/picture">
+                  <wp:extent cx="4697718" cy="8351499"/>
+                  <wp:docPr id="16" name="Picture 16"/>
+                  <wp:cNvGraphicFramePr>
+                    <a:graphicFrameLocks noChangeAspect="1"/>
+                  </wp:cNvGraphicFramePr>
+                  <a:graphic>
+                    <a:graphicData uri="http://schemas.openxmlformats.org/drawingml/2006/picture">
+                      <pic:pic>
+                        <pic:nvPicPr>
+                          <pic:cNvPr id="0" name="image.jpg"/>
+                          <pic:cNvPicPr/>
+                        </pic:nvPicPr>
+                        <pic:blipFill>
+                          <a:blip r:embed="rId25"/>
+                          <a:stretch>
+                            <a:fillRect/>
+                          </a:stretch>
+                        </pic:blipFill>
+                        <pic:spPr>
+                          <a:xfrm>
+                            <a:off x="0" y="0"/>
+                            <a:ext cx="4697718" cy="8351499"/>
+                          </a:xfrm>
+                          <a:prstGeom prst="rect"/>
+                        </pic:spPr>
+                      </pic:pic>
+                    </a:graphicData>
+                  </a:graphic>
+                </wp:inline>
+              </w:drawing>
+            </w:r>
+          </w:p>
+          <w:p>
+            <w:pPr>
+              <w:spacing w:before="0" w:after="20" w:line="216" w:lineRule="exact"/>
+            </w:pPr>
+            <w:r>
+              <w:rPr>
+                <w:b w:val="0"/>
+                <w:i w:val="0"/>
+                <w:color w:val="666666"/>
+                <w:sz w:val="18"/>
+              </w:rPr>
+              <w:t>PASO 16 · APAGADO Y SEGURIDAD · 09:43</w:t>
+            </w:r>
+          </w:p>
+          <w:p>
+            <w:pPr>
+              <w:spacing w:before="0" w:after="20" w:line="360" w:lineRule="exact"/>
+            </w:pPr>
+            <w:r>
+              <w:rPr>
+                <w:b/>
+                <w:i w:val="0"/>
+                <w:color w:val="111111"/>
+                <w:sz w:val="30"/>
+              </w:rPr>
+              <w:t>Estabilizar temperatura antes de operar</w:t>
+            </w:r>
+          </w:p>
+          <w:p>
+            <w:pPr>
+              <w:spacing w:before="0" w:after="0" w:line="276" w:lineRule="exact"/>
+            </w:pPr>
+            <w:r>
+              <w:rPr>
+                <w:b w:val="0"/>
+                <w:i w:val="0"/>
+                <w:color w:val="222222"/>
+                <w:sz w:val="23"/>
+              </w:rPr>
+              <w:t>Al restablecer la energia tras un corte largo, espere de 2 a 3 horas antes de realizar estudios para que la camara de detectores alcance una temperatura estable y evitar artefactos en la imagen. El tomografo Canon Aquilion Exceed LB debe climatizarse.</w:t>
+            </w:r>
+          </w:p>
+        </w:tc>
+      </w:tr>
+    </w:tbl>
+    <w:p>
+      <w:pPr>
+        <w:sectPr>
+          <w:pgSz w:w="11906" w:h="16838"/>
+          <w:pgMar w:top="567" w:right="567" w:bottom="567" w:left="567" w:header="283" w:footer="283" w:gutter="0"/>
+          <w:cols w:space="720"/>
+          <w:docGrid w:linePitch="360"/>
+        </w:sectPr>
+      </w:pPr>
+    </w:p>
+    <w:p>
+      <w:pPr>
+        <w:pageBreakBefore w:val="0"/>
+        <w:pBdr>
+          <w:bottom w:val="single" w:sz="4" w:space="2" w:color="BBBBBB"/>
+        </w:pBdr>
+        <w:tabs>
+          <w:tab w:pos="10772" w:val="right"/>
+        </w:tabs>
+        <w:spacing w:before="0" w:after="80" w:line="192" w:lineRule="exact"/>
+      </w:pPr>
+      <w:r>
+        <w:rPr>
+          <w:b w:val="0"/>
+          <w:i w:val="0"/>
+          <w:color w:val="666666"/>
+          <w:sz w:val="16"/>
+        </w:rPr>
+        <w:t>Introducción y especificaciones del Aquilion Exceed LB</w:t>
+      </w:r>
+      <w:r>
+        <w:rPr>
+          <w:b w:val="0"/>
+          <w:i w:val="0"/>
+          <w:color w:val="666666"/>
+          <w:sz w:val="16"/>
+        </w:rPr>
+        <w:tab/>
+        <w:t>Transcripción (1 de 3)</w:t>
       </w:r>
     </w:p>
     <w:p>
@@ -3848,37 +4436,6 @@
     </w:p>
     <w:p>
       <w:pPr>
-        <w:pageBreakBefore/>
-        <w:pBdr>
-          <w:bottom w:val="single" w:sz="4" w:space="2" w:color="BBBBBB"/>
-        </w:pBdr>
-        <w:tabs>
-          <w:tab w:pos="15704" w:val="right"/>
-        </w:tabs>
-        <w:spacing w:before="0" w:after="80" w:line="192" w:lineRule="exact"/>
-      </w:pPr>
-      <w:r>
-        <w:rPr>
-          <w:b w:val="0"/>
-          <w:i w:val="0"/>
-          <w:color w:val="666666"/>
-          <w:sz w:val="16"/>
-        </w:rPr>
-        <w:t>Introducción y especificaciones del Aquilion Exceed LB</w:t>
-      </w:r>
-      <w:r>
-        <w:rPr>
-          <w:b w:val="0"/>
-          <w:i w:val="0"/>
-          <w:color w:val="666666"/>
-          <w:sz w:val="16"/>
-        </w:rPr>
-        <w:tab/>
-        <w:t>Transcripción (2 de 4)</w:t>
-      </w:r>
-    </w:p>
-    <w:p>
-      <w:pPr>
         <w:tabs>
           <w:tab w:pos="850" w:val="left"/>
         </w:tabs>
@@ -4015,6 +4572,37 @@
           <w:sz w:val="19"/>
         </w:rPr>
         <w:t>Y de ahí pasa toda la energía. Van a ver que tiene todos los led verdes, el de ahí también tiene los led verdes por adelante, con la cámara, el circulito, quiere decir que está energizado.</w:t>
+      </w:r>
+    </w:p>
+    <w:p>
+      <w:pPr>
+        <w:pageBreakBefore/>
+        <w:pBdr>
+          <w:bottom w:val="single" w:sz="4" w:space="2" w:color="BBBBBB"/>
+        </w:pBdr>
+        <w:tabs>
+          <w:tab w:pos="10772" w:val="right"/>
+        </w:tabs>
+        <w:spacing w:before="0" w:after="80" w:line="192" w:lineRule="exact"/>
+      </w:pPr>
+      <w:r>
+        <w:rPr>
+          <w:b w:val="0"/>
+          <w:i w:val="0"/>
+          <w:color w:val="666666"/>
+          <w:sz w:val="16"/>
+        </w:rPr>
+        <w:t>Introducción y especificaciones del Aquilion Exceed LB</w:t>
+      </w:r>
+      <w:r>
+        <w:rPr>
+          <w:b w:val="0"/>
+          <w:i w:val="0"/>
+          <w:color w:val="666666"/>
+          <w:sz w:val="16"/>
+        </w:rPr>
+        <w:tab/>
+        <w:t>Transcripción (2 de 3)</w:t>
       </w:r>
     </w:p>
     <w:p>
@@ -4663,37 +5251,6 @@
     </w:p>
     <w:p>
       <w:pPr>
-        <w:pageBreakBefore/>
-        <w:pBdr>
-          <w:bottom w:val="single" w:sz="4" w:space="2" w:color="BBBBBB"/>
-        </w:pBdr>
-        <w:tabs>
-          <w:tab w:pos="15704" w:val="right"/>
-        </w:tabs>
-        <w:spacing w:before="0" w:after="80" w:line="192" w:lineRule="exact"/>
-      </w:pPr>
-      <w:r>
-        <w:rPr>
-          <w:b w:val="0"/>
-          <w:i w:val="0"/>
-          <w:color w:val="666666"/>
-          <w:sz w:val="16"/>
-        </w:rPr>
-        <w:t>Introducción y especificaciones del Aquilion Exceed LB</w:t>
-      </w:r>
-      <w:r>
-        <w:rPr>
-          <w:b w:val="0"/>
-          <w:i w:val="0"/>
-          <w:color w:val="666666"/>
-          <w:sz w:val="16"/>
-        </w:rPr>
-        <w:tab/>
-        <w:t>Transcripción (3 de 4)</w:t>
-      </w:r>
-    </w:p>
-    <w:p>
-      <w:pPr>
         <w:tabs>
           <w:tab w:pos="850" w:val="left"/>
         </w:tabs>
@@ -4914,6 +5471,37 @@
           <w:sz w:val="19"/>
         </w:rPr>
         <w:t>Entonces, si le dijeron a las 6:00, ustedes dicen a las 5:00 de la tarde hago el último paciente y no hago más para darle tiempo que el tubo se enfríe.</w:t>
+      </w:r>
+    </w:p>
+    <w:p>
+      <w:pPr>
+        <w:pageBreakBefore/>
+        <w:pBdr>
+          <w:bottom w:val="single" w:sz="4" w:space="2" w:color="BBBBBB"/>
+        </w:pBdr>
+        <w:tabs>
+          <w:tab w:pos="10772" w:val="right"/>
+        </w:tabs>
+        <w:spacing w:before="0" w:after="80" w:line="192" w:lineRule="exact"/>
+      </w:pPr>
+      <w:r>
+        <w:rPr>
+          <w:b w:val="0"/>
+          <w:i w:val="0"/>
+          <w:color w:val="666666"/>
+          <w:sz w:val="16"/>
+        </w:rPr>
+        <w:t>Introducción y especificaciones del Aquilion Exceed LB</w:t>
+      </w:r>
+      <w:r>
+        <w:rPr>
+          <w:b w:val="0"/>
+          <w:i w:val="0"/>
+          <w:color w:val="666666"/>
+          <w:sz w:val="16"/>
+        </w:rPr>
+        <w:tab/>
+        <w:t>Transcripción (3 de 3)</w:t>
       </w:r>
     </w:p>
     <w:p>
@@ -5394,37 +5982,6 @@
     </w:p>
     <w:p>
       <w:pPr>
-        <w:pageBreakBefore/>
-        <w:pBdr>
-          <w:bottom w:val="single" w:sz="4" w:space="2" w:color="BBBBBB"/>
-        </w:pBdr>
-        <w:tabs>
-          <w:tab w:pos="15704" w:val="right"/>
-        </w:tabs>
-        <w:spacing w:before="0" w:after="80" w:line="192" w:lineRule="exact"/>
-      </w:pPr>
-      <w:r>
-        <w:rPr>
-          <w:b w:val="0"/>
-          <w:i w:val="0"/>
-          <w:color w:val="666666"/>
-          <w:sz w:val="16"/>
-        </w:rPr>
-        <w:t>Introducción y especificaciones del Aquilion Exceed LB</w:t>
-      </w:r>
-      <w:r>
-        <w:rPr>
-          <w:b w:val="0"/>
-          <w:i w:val="0"/>
-          <w:color w:val="666666"/>
-          <w:sz w:val="16"/>
-        </w:rPr>
-        <w:tab/>
-        <w:t>Transcripción (4 de 4)</w:t>
-      </w:r>
-    </w:p>
-    <w:p>
-      <w:pPr>
         <w:tabs>
           <w:tab w:pos="850" w:val="left"/>
         </w:tabs>
@@ -5548,11 +6105,9 @@
       </w:r>
     </w:p>
     <w:sectPr>
-      <w:footerReference w:type="default" r:id="rId9"/>
-      <w:pgSz w:w="16838" w:h="11906" w:orient="landscape"/>
+      <w:pgSz w:w="11906" w:h="16838"/>
       <w:pgMar w:top="567" w:right="567" w:bottom="567" w:left="567" w:header="283" w:footer="283" w:gutter="0"/>
       <w:cols w:space="720"/>
-      <w:titlePg/>
       <w:docGrid w:linePitch="360"/>
     </w:sectPr>
   </w:body>

</xml_diff>